<commit_message>
Sync design with the M1 accounts API as built
- Reset and email-confirmation links use URL fragments
  (/reset#token=..., /verify-email#token=...)
- Rate-limit table updated (failed-login counting, X-Real-IP keying,
  resend and handoff limits)
- New §5.9 endpoint reference for the site (M2) to build against
- game_launched is logged when the handoff code is issued
- email_outbox columns match the migration; M1 marked built, not deployed
- Agent calls A25-A31 recorded in the ledger; Word version regenerated

Co-Authored-By: Claude Opus 5.5 <noreply@anthropic.com>
Claude-Session: https://claude.ai/code/session_01N7nSKWzsuTFN8SufzNzF6N
</commit_message>
<xml_diff>
--- a/docs/Gametronyx_site_design.docx
+++ b/docs/Gametronyx_site_design.docx
@@ -2918,8 +2918,8 @@
         <w:tblLayout w:type="fixed"/>
       </w:tblPr>
       <w:tblGrid>
-        <w:gridCol w:w="2306"/>
-        <w:gridCol w:w="7414"/>
+        <w:gridCol w:w="1978"/>
+        <w:gridCol w:w="7742"/>
       </w:tblGrid>
       <w:tr>
         <w:trPr>
@@ -2927,7 +2927,7 @@
         </w:trPr>
         <w:tc>
           <w:tcPr>
-            <w:tcW w:type="dxa" w:w="2306"/>
+            <w:tcW w:type="dxa" w:w="1978"/>
             <w:tcBorders>
               <w:top w:val="single" w:color="BFBFBF" w:sz="4"/>
               <w:left w:val="single" w:color="BFBFBF" w:sz="4"/>
@@ -2961,7 +2961,7 @@
         </w:tc>
         <w:tc>
           <w:tcPr>
-            <w:tcW w:type="dxa" w:w="7414"/>
+            <w:tcW w:type="dxa" w:w="7742"/>
             <w:tcBorders>
               <w:top w:val="single" w:color="BFBFBF" w:sz="4"/>
               <w:left w:val="single" w:color="BFBFBF" w:sz="4"/>
@@ -3000,7 +3000,7 @@
         </w:trPr>
         <w:tc>
           <w:tcPr>
-            <w:tcW w:type="dxa" w:w="2306"/>
+            <w:tcW w:type="dxa" w:w="1978"/>
             <w:tcBorders>
               <w:top w:val="single" w:color="BFBFBF" w:sz="4"/>
               <w:left w:val="single" w:color="BFBFBF" w:sz="4"/>
@@ -3030,7 +3030,7 @@
         </w:tc>
         <w:tc>
           <w:tcPr>
-            <w:tcW w:type="dxa" w:w="7414"/>
+            <w:tcW w:type="dxa" w:w="7742"/>
             <w:tcBorders>
               <w:top w:val="single" w:color="BFBFBF" w:sz="4"/>
               <w:left w:val="single" w:color="BFBFBF" w:sz="4"/>
@@ -3129,7 +3129,7 @@
         </w:trPr>
         <w:tc>
           <w:tcPr>
-            <w:tcW w:type="dxa" w:w="2306"/>
+            <w:tcW w:type="dxa" w:w="1978"/>
             <w:tcBorders>
               <w:top w:val="single" w:color="BFBFBF" w:sz="4"/>
               <w:left w:val="single" w:color="BFBFBF" w:sz="4"/>
@@ -3159,7 +3159,7 @@
         </w:tc>
         <w:tc>
           <w:tcPr>
-            <w:tcW w:type="dxa" w:w="7414"/>
+            <w:tcW w:type="dxa" w:w="7742"/>
             <w:tcBorders>
               <w:top w:val="single" w:color="BFBFBF" w:sz="4"/>
               <w:left w:val="single" w:color="BFBFBF" w:sz="4"/>
@@ -3194,7 +3194,7 @@
         </w:trPr>
         <w:tc>
           <w:tcPr>
-            <w:tcW w:type="dxa" w:w="2306"/>
+            <w:tcW w:type="dxa" w:w="1978"/>
             <w:tcBorders>
               <w:top w:val="single" w:color="BFBFBF" w:sz="4"/>
               <w:left w:val="single" w:color="BFBFBF" w:sz="4"/>
@@ -3224,7 +3224,7 @@
         </w:tc>
         <w:tc>
           <w:tcPr>
-            <w:tcW w:type="dxa" w:w="7414"/>
+            <w:tcW w:type="dxa" w:w="7742"/>
             <w:tcBorders>
               <w:top w:val="single" w:color="BFBFBF" w:sz="4"/>
               <w:left w:val="single" w:color="BFBFBF" w:sz="4"/>
@@ -3275,7 +3275,7 @@
         </w:trPr>
         <w:tc>
           <w:tcPr>
-            <w:tcW w:type="dxa" w:w="2306"/>
+            <w:tcW w:type="dxa" w:w="1978"/>
             <w:tcBorders>
               <w:top w:val="single" w:color="BFBFBF" w:sz="4"/>
               <w:left w:val="single" w:color="BFBFBF" w:sz="4"/>
@@ -3305,7 +3305,7 @@
         </w:tc>
         <w:tc>
           <w:tcPr>
-            <w:tcW w:type="dxa" w:w="7414"/>
+            <w:tcW w:type="dxa" w:w="7742"/>
             <w:tcBorders>
               <w:top w:val="single" w:color="BFBFBF" w:sz="4"/>
               <w:left w:val="single" w:color="BFBFBF" w:sz="4"/>
@@ -3358,7 +3358,7 @@
         </w:trPr>
         <w:tc>
           <w:tcPr>
-            <w:tcW w:type="dxa" w:w="2306"/>
+            <w:tcW w:type="dxa" w:w="1978"/>
             <w:tcBorders>
               <w:top w:val="single" w:color="BFBFBF" w:sz="4"/>
               <w:left w:val="single" w:color="BFBFBF" w:sz="4"/>
@@ -3384,51 +3384,51 @@
               </w:rPr>
               <w:t xml:space="preserve">/reset</w:t>
             </w:r>
-            <w:r>
-              <w:rPr>
-                <w:rFonts w:ascii="Calibri" w:cs="Calibri" w:eastAsia="Calibri" w:hAnsi="Calibri"/>
-                <w:sz w:val="19"/>
-                <w:szCs w:val="19"/>
-              </w:rPr>
-              <w:t xml:space="preserve"> and </w:t>
-            </w:r>
-            <w:r>
-              <w:rPr>
-                <w:rFonts w:ascii="Courier New" w:cs="Courier New" w:eastAsia="Courier New" w:hAnsi="Courier New"/>
-                <w:sz w:val="17"/>
-                <w:szCs w:val="17"/>
-              </w:rPr>
-              <w:t xml:space="preserve">/reset/:token</w:t>
-            </w:r>
-          </w:p>
-        </w:tc>
-        <w:tc>
-          <w:tcPr>
-            <w:tcW w:type="dxa" w:w="7414"/>
-            <w:tcBorders>
-              <w:top w:val="single" w:color="BFBFBF" w:sz="4"/>
-              <w:left w:val="single" w:color="BFBFBF" w:sz="4"/>
-              <w:bottom w:val="single" w:color="BFBFBF" w:sz="4"/>
-              <w:right w:val="single" w:color="BFBFBF" w:sz="4"/>
-            </w:tcBorders>
-            <w:tcMar>
-              <w:top w:type="dxa" w:w="60"/>
-              <w:left w:type="dxa" w:w="100"/>
-              <w:bottom w:type="dxa" w:w="60"/>
-              <w:right w:type="dxa" w:w="100"/>
-            </w:tcMar>
-          </w:tcPr>
-          <w:p>
-            <w:pPr>
-              <w:spacing w:after="0"/>
-            </w:pPr>
-            <w:r>
-              <w:rPr>
-                <w:rFonts w:ascii="Calibri" w:cs="Calibri" w:eastAsia="Calibri" w:hAnsi="Calibri"/>
-                <w:sz w:val="19"/>
-                <w:szCs w:val="19"/>
-              </w:rPr>
-              <w:t xml:space="preserve">Request a reset link by email, then set a new password.</w:t>
+          </w:p>
+        </w:tc>
+        <w:tc>
+          <w:tcPr>
+            <w:tcW w:type="dxa" w:w="7742"/>
+            <w:tcBorders>
+              <w:top w:val="single" w:color="BFBFBF" w:sz="4"/>
+              <w:left w:val="single" w:color="BFBFBF" w:sz="4"/>
+              <w:bottom w:val="single" w:color="BFBFBF" w:sz="4"/>
+              <w:right w:val="single" w:color="BFBFBF" w:sz="4"/>
+            </w:tcBorders>
+            <w:tcMar>
+              <w:top w:type="dxa" w:w="60"/>
+              <w:left w:type="dxa" w:w="100"/>
+              <w:bottom w:type="dxa" w:w="60"/>
+              <w:right w:type="dxa" w:w="100"/>
+            </w:tcMar>
+          </w:tcPr>
+          <w:p>
+            <w:pPr>
+              <w:spacing w:after="0"/>
+            </w:pPr>
+            <w:r>
+              <w:rPr>
+                <w:rFonts w:ascii="Calibri" w:cs="Calibri" w:eastAsia="Calibri" w:hAnsi="Calibri"/>
+                <w:sz w:val="19"/>
+                <w:szCs w:val="19"/>
+              </w:rPr>
+              <w:t xml:space="preserve">Request a reset link by email. </w:t>
+            </w:r>
+            <w:r>
+              <w:rPr>
+                <w:rFonts w:ascii="Courier New" w:cs="Courier New" w:eastAsia="Courier New" w:hAnsi="Courier New"/>
+                <w:sz w:val="17"/>
+                <w:szCs w:val="17"/>
+              </w:rPr>
+              <w:t xml:space="preserve">/reset#token=…</w:t>
+            </w:r>
+            <w:r>
+              <w:rPr>
+                <w:rFonts w:ascii="Calibri" w:cs="Calibri" w:eastAsia="Calibri" w:hAnsi="Calibri"/>
+                <w:sz w:val="19"/>
+                <w:szCs w:val="19"/>
+              </w:rPr>
+              <w:t xml:space="preserve"> (the emailed link) sets a new password. Tokens ride in the URL fragment so they never reach a server log.</w:t>
             </w:r>
           </w:p>
         </w:tc>
@@ -3439,7 +3439,72 @@
         </w:trPr>
         <w:tc>
           <w:tcPr>
-            <w:tcW w:type="dxa" w:w="2306"/>
+            <w:tcW w:type="dxa" w:w="1978"/>
+            <w:tcBorders>
+              <w:top w:val="single" w:color="BFBFBF" w:sz="4"/>
+              <w:left w:val="single" w:color="BFBFBF" w:sz="4"/>
+              <w:bottom w:val="single" w:color="BFBFBF" w:sz="4"/>
+              <w:right w:val="single" w:color="BFBFBF" w:sz="4"/>
+            </w:tcBorders>
+            <w:tcMar>
+              <w:top w:type="dxa" w:w="60"/>
+              <w:left w:type="dxa" w:w="100"/>
+              <w:bottom w:type="dxa" w:w="60"/>
+              <w:right w:type="dxa" w:w="100"/>
+            </w:tcMar>
+          </w:tcPr>
+          <w:p>
+            <w:pPr>
+              <w:spacing w:after="0"/>
+            </w:pPr>
+            <w:r>
+              <w:rPr>
+                <w:rFonts w:ascii="Courier New" w:cs="Courier New" w:eastAsia="Courier New" w:hAnsi="Courier New"/>
+                <w:sz w:val="17"/>
+                <w:szCs w:val="17"/>
+              </w:rPr>
+              <w:t xml:space="preserve">/verify-email#token=…</w:t>
+            </w:r>
+          </w:p>
+        </w:tc>
+        <w:tc>
+          <w:tcPr>
+            <w:tcW w:type="dxa" w:w="7742"/>
+            <w:tcBorders>
+              <w:top w:val="single" w:color="BFBFBF" w:sz="4"/>
+              <w:left w:val="single" w:color="BFBFBF" w:sz="4"/>
+              <w:bottom w:val="single" w:color="BFBFBF" w:sz="4"/>
+              <w:right w:val="single" w:color="BFBFBF" w:sz="4"/>
+            </w:tcBorders>
+            <w:tcMar>
+              <w:top w:type="dxa" w:w="60"/>
+              <w:left w:type="dxa" w:w="100"/>
+              <w:bottom w:type="dxa" w:w="60"/>
+              <w:right w:type="dxa" w:w="100"/>
+            </w:tcMar>
+          </w:tcPr>
+          <w:p>
+            <w:pPr>
+              <w:spacing w:after="0"/>
+            </w:pPr>
+            <w:r>
+              <w:rPr>
+                <w:rFonts w:ascii="Calibri" w:cs="Calibri" w:eastAsia="Calibri" w:hAnsi="Calibri"/>
+                <w:sz w:val="19"/>
+                <w:szCs w:val="19"/>
+              </w:rPr>
+              <w:t xml:space="preserve">Confirms the player's email from the welcome or change-of-email message. Works without being logged in.</w:t>
+            </w:r>
+          </w:p>
+        </w:tc>
+      </w:tr>
+      <w:tr>
+        <w:trPr>
+          <w:tblHeader w:val="false"/>
+        </w:trPr>
+        <w:tc>
+          <w:tcPr>
+            <w:tcW w:type="dxa" w:w="1978"/>
             <w:tcBorders>
               <w:top w:val="single" w:color="BFBFBF" w:sz="4"/>
               <w:left w:val="single" w:color="BFBFBF" w:sz="4"/>
@@ -3469,7 +3534,7 @@
         </w:tc>
         <w:tc>
           <w:tcPr>
-            <w:tcW w:type="dxa" w:w="7414"/>
+            <w:tcW w:type="dxa" w:w="7742"/>
             <w:tcBorders>
               <w:top w:val="single" w:color="BFBFBF" w:sz="4"/>
               <w:left w:val="single" w:color="BFBFBF" w:sz="4"/>
@@ -5845,7 +5910,21 @@
         <w:rPr>
           <w:rFonts w:ascii="Calibri" w:cs="Calibri" w:eastAsia="Calibri" w:hAnsi="Calibri"/>
         </w:rPr>
-        <w:t xml:space="preserve">: v1 does not block on verification. The welcome email includes a "confirm this is you" link that sets </w:t>
+        <w:t xml:space="preserve">: v1 does not block on verification. The welcome email includes a "confirm this is you" link (</w:t>
+      </w:r>
+      <w:r>
+        <w:rPr>
+          <w:rFonts w:ascii="Courier New" w:cs="Courier New" w:eastAsia="Courier New" w:hAnsi="Courier New"/>
+          <w:sz w:val="19"/>
+          <w:szCs w:val="19"/>
+        </w:rPr>
+        <w:t xml:space="preserve">/verify-email#token=…</w:t>
+      </w:r>
+      <w:r>
+        <w:rPr>
+          <w:rFonts w:ascii="Calibri" w:cs="Calibri" w:eastAsia="Calibri" w:hAnsi="Calibri"/>
+        </w:rPr>
+        <w:t xml:space="preserve">, valid 7 days) that sets </w:t>
       </w:r>
       <w:r>
         <w:rPr>
@@ -5859,7 +5938,7 @@
         <w:rPr>
           <w:rFonts w:ascii="Calibri" w:cs="Calibri" w:eastAsia="Calibri" w:hAnsi="Calibri"/>
         </w:rPr>
-        <w:t xml:space="preserve">. Admin sees who is unverified.</w:t>
+        <w:t xml:space="preserve">. Changing the email voids the old link and sends a new one. Admin sees who is unverified.</w:t>
       </w:r>
     </w:p>
     <w:p>
@@ -6005,7 +6084,21 @@
         <w:rPr>
           <w:rFonts w:ascii="Calibri" w:cs="Calibri" w:eastAsia="Calibri" w:hAnsi="Calibri"/>
         </w:rPr>
-        <w:t xml:space="preserve">It emails a one-time link that is valid for 1 hour. The token is stored hashed.</w:t>
+        <w:t xml:space="preserve">It emails a one-time link (</w:t>
+      </w:r>
+      <w:r>
+        <w:rPr>
+          <w:rFonts w:ascii="Courier New" w:cs="Courier New" w:eastAsia="Courier New" w:hAnsi="Courier New"/>
+          <w:sz w:val="19"/>
+          <w:szCs w:val="19"/>
+        </w:rPr>
+        <w:t xml:space="preserve">/reset#token=…</w:t>
+      </w:r>
+      <w:r>
+        <w:rPr>
+          <w:rFonts w:ascii="Calibri" w:cs="Calibri" w:eastAsia="Calibri" w:hAnsi="Calibri"/>
+        </w:rPr>
+        <w:t xml:space="preserve">) that is valid for 1 hour. The token is stored hashed.</w:t>
       </w:r>
     </w:p>
     <w:p>
@@ -6021,6 +6114,22 @@
         <w:rPr>
           <w:rFonts w:ascii="Calibri" w:cs="Calibri" w:eastAsia="Calibri" w:hAnsi="Calibri"/>
         </w:rPr>
+        <w:t xml:space="preserve">Setting the new password burns every outstanding link for the account and signs out all other sessions, on NEWU too.</w:t>
+      </w:r>
+    </w:p>
+    <w:p>
+      <w:pPr>
+        <w:pStyle w:val="ListParagraph"/>
+        <w:numPr>
+          <w:ilvl w:val="0"/>
+          <w:numId w:val="3"/>
+        </w:numPr>
+        <w:spacing w:after="40"/>
+      </w:pPr>
+      <w:r>
+        <w:rPr>
+          <w:rFonts w:ascii="Calibri" w:cs="Calibri" w:eastAsia="Calibri" w:hAnsi="Calibri"/>
+        </w:rPr>
         <w:t xml:space="preserve">For players who have no email yet, admin can set a temporary password from the Players tab and tell them directly.</w:t>
       </w:r>
     </w:p>
@@ -6219,7 +6328,7 @@
         <w:rPr>
           <w:rFonts w:ascii="Calibri" w:cs="Calibri" w:eastAsia="Calibri" w:hAnsi="Calibri"/>
         </w:rPr>
-        <w:t xml:space="preserve">The game logs a </w:t>
+        <w:t xml:space="preserve">The API logs a </w:t>
       </w:r>
       <w:r>
         <w:rPr>
@@ -6233,7 +6342,7 @@
         <w:rPr>
           <w:rFonts w:ascii="Calibri" w:cs="Calibri" w:eastAsia="Calibri" w:hAnsi="Calibri"/>
         </w:rPr>
-        <w:t xml:space="preserve"> activity event.</w:t>
+        <w:t xml:space="preserve"> activity event when it issues the code.</w:t>
       </w:r>
     </w:p>
     <w:p>
@@ -6472,7 +6581,49 @@
         <w:rPr>
           <w:rFonts w:ascii="Calibri" w:cs="Calibri" w:eastAsia="Calibri" w:hAnsi="Calibri"/>
         </w:rPr>
-        <w:t xml:space="preserve">In-memory per-process limits are enough at this scale, because there is a single API container.</w:t>
+        <w:t xml:space="preserve">In-memory per-process limits are enough at this scale, because there is a single API container. They key on the </w:t>
+      </w:r>
+      <w:r>
+        <w:rPr>
+          <w:rFonts w:ascii="Courier New" w:cs="Courier New" w:eastAsia="Courier New" w:hAnsi="Courier New"/>
+          <w:sz w:val="19"/>
+          <w:szCs w:val="19"/>
+        </w:rPr>
+        <w:t xml:space="preserve">X-Real-IP</w:t>
+      </w:r>
+      <w:r>
+        <w:rPr>
+          <w:rFonts w:ascii="Calibri" w:cs="Calibri" w:eastAsia="Calibri" w:hAnsi="Calibri"/>
+        </w:rPr>
+        <w:t xml:space="preserve"> header nginx sets, never on </w:t>
+      </w:r>
+      <w:r>
+        <w:rPr>
+          <w:rFonts w:ascii="Courier New" w:cs="Courier New" w:eastAsia="Courier New" w:hAnsi="Courier New"/>
+          <w:sz w:val="19"/>
+          <w:szCs w:val="19"/>
+        </w:rPr>
+        <w:t xml:space="preserve">X-Forwarded-For</w:t>
+      </w:r>
+      <w:r>
+        <w:rPr>
+          <w:rFonts w:ascii="Calibri" w:cs="Calibri" w:eastAsia="Calibri" w:hAnsi="Calibri"/>
+        </w:rPr>
+        <w:t xml:space="preserve">, whose first hop the client controls. If a request arrives without </w:t>
+      </w:r>
+      <w:r>
+        <w:rPr>
+          <w:rFonts w:ascii="Courier New" w:cs="Courier New" w:eastAsia="Courier New" w:hAnsi="Courier New"/>
+          <w:sz w:val="19"/>
+          <w:szCs w:val="19"/>
+        </w:rPr>
+        <w:t xml:space="preserve">X-Real-IP</w:t>
+      </w:r>
+      <w:r>
+        <w:rPr>
+          <w:rFonts w:ascii="Calibri" w:cs="Calibri" w:eastAsia="Calibri" w:hAnsi="Calibri"/>
+        </w:rPr>
+        <w:t xml:space="preserve"> (a misconfigured proxy), the per-IP-only buckets switch off rather than lumping every player into one bucket.</w:t>
       </w:r>
     </w:p>
     <w:tbl>
@@ -6489,8 +6640,8 @@
         <w:tblLayout w:type="fixed"/>
       </w:tblPr>
       <w:tblGrid>
-        <w:gridCol w:w="2630"/>
-        <w:gridCol w:w="7090"/>
+        <w:gridCol w:w="2271"/>
+        <w:gridCol w:w="7449"/>
       </w:tblGrid>
       <w:tr>
         <w:trPr>
@@ -6498,7 +6649,7 @@
         </w:trPr>
         <w:tc>
           <w:tcPr>
-            <w:tcW w:type="dxa" w:w="2630"/>
+            <w:tcW w:type="dxa" w:w="2271"/>
             <w:tcBorders>
               <w:top w:val="single" w:color="BFBFBF" w:sz="4"/>
               <w:left w:val="single" w:color="BFBFBF" w:sz="4"/>
@@ -6532,7 +6683,7 @@
         </w:tc>
         <w:tc>
           <w:tcPr>
-            <w:tcW w:type="dxa" w:w="7090"/>
+            <w:tcW w:type="dxa" w:w="7449"/>
             <w:tcBorders>
               <w:top w:val="single" w:color="BFBFBF" w:sz="4"/>
               <w:left w:val="single" w:color="BFBFBF" w:sz="4"/>
@@ -6571,7 +6722,7 @@
         </w:trPr>
         <w:tc>
           <w:tcPr>
-            <w:tcW w:type="dxa" w:w="2630"/>
+            <w:tcW w:type="dxa" w:w="2271"/>
             <w:tcBorders>
               <w:top w:val="single" w:color="BFBFBF" w:sz="4"/>
               <w:left w:val="single" w:color="BFBFBF" w:sz="4"/>
@@ -6601,31 +6752,49 @@
         </w:tc>
         <w:tc>
           <w:tcPr>
-            <w:tcW w:type="dxa" w:w="7090"/>
-            <w:tcBorders>
-              <w:top w:val="single" w:color="BFBFBF" w:sz="4"/>
-              <w:left w:val="single" w:color="BFBFBF" w:sz="4"/>
-              <w:bottom w:val="single" w:color="BFBFBF" w:sz="4"/>
-              <w:right w:val="single" w:color="BFBFBF" w:sz="4"/>
-            </w:tcBorders>
-            <w:tcMar>
-              <w:top w:type="dxa" w:w="60"/>
-              <w:left w:type="dxa" w:w="100"/>
-              <w:bottom w:type="dxa" w:w="60"/>
-              <w:right w:type="dxa" w:w="100"/>
-            </w:tcMar>
-          </w:tcPr>
-          <w:p>
-            <w:pPr>
-              <w:spacing w:after="0"/>
-            </w:pPr>
-            <w:r>
-              <w:rPr>
-                <w:rFonts w:ascii="Calibri" w:cs="Calibri" w:eastAsia="Calibri" w:hAnsi="Calibri"/>
-                <w:sz w:val="19"/>
-                <w:szCs w:val="19"/>
-              </w:rPr>
-              <w:t xml:space="preserve">10 attempts / 15 min per IP + username, and 50 / 15 min per IP</w:t>
+            <w:tcW w:type="dxa" w:w="7449"/>
+            <w:tcBorders>
+              <w:top w:val="single" w:color="BFBFBF" w:sz="4"/>
+              <w:left w:val="single" w:color="BFBFBF" w:sz="4"/>
+              <w:bottom w:val="single" w:color="BFBFBF" w:sz="4"/>
+              <w:right w:val="single" w:color="BFBFBF" w:sz="4"/>
+            </w:tcBorders>
+            <w:tcMar>
+              <w:top w:type="dxa" w:w="60"/>
+              <w:left w:type="dxa" w:w="100"/>
+              <w:bottom w:type="dxa" w:w="60"/>
+              <w:right w:type="dxa" w:w="100"/>
+            </w:tcMar>
+          </w:tcPr>
+          <w:p>
+            <w:pPr>
+              <w:spacing w:after="0"/>
+            </w:pPr>
+            <w:r>
+              <w:rPr>
+                <w:rFonts w:ascii="Calibri" w:cs="Calibri" w:eastAsia="Calibri" w:hAnsi="Calibri"/>
+                <w:sz w:val="19"/>
+                <w:szCs w:val="19"/>
+              </w:rPr>
+              <w:t xml:space="preserve">10 </w:t>
+            </w:r>
+            <w:r>
+              <w:rPr>
+                <w:rFonts w:ascii="Calibri" w:cs="Calibri" w:eastAsia="Calibri" w:hAnsi="Calibri"/>
+                <w:b/>
+                <w:bCs/>
+                <w:sz w:val="19"/>
+                <w:szCs w:val="19"/>
+              </w:rPr>
+              <w:t xml:space="preserve">failed</w:t>
+            </w:r>
+            <w:r>
+              <w:rPr>
+                <w:rFonts w:ascii="Calibri" w:cs="Calibri" w:eastAsia="Calibri" w:hAnsi="Calibri"/>
+                <w:sz w:val="19"/>
+                <w:szCs w:val="19"/>
+              </w:rPr>
+              <w:t xml:space="preserve"> attempts / 15 min per IP + username, and 50 attempts / 15 min per IP</w:t>
             </w:r>
           </w:p>
         </w:tc>
@@ -6636,7 +6805,7 @@
         </w:trPr>
         <w:tc>
           <w:tcPr>
-            <w:tcW w:type="dxa" w:w="2630"/>
+            <w:tcW w:type="dxa" w:w="2271"/>
             <w:tcBorders>
               <w:top w:val="single" w:color="BFBFBF" w:sz="4"/>
               <w:left w:val="single" w:color="BFBFBF" w:sz="4"/>
@@ -6666,7 +6835,7 @@
         </w:tc>
         <w:tc>
           <w:tcPr>
-            <w:tcW w:type="dxa" w:w="7090"/>
+            <w:tcW w:type="dxa" w:w="7449"/>
             <w:tcBorders>
               <w:top w:val="single" w:color="BFBFBF" w:sz="4"/>
               <w:left w:val="single" w:color="BFBFBF" w:sz="4"/>
@@ -6701,7 +6870,7 @@
         </w:trPr>
         <w:tc>
           <w:tcPr>
-            <w:tcW w:type="dxa" w:w="2630"/>
+            <w:tcW w:type="dxa" w:w="2271"/>
             <w:tcBorders>
               <w:top w:val="single" w:color="BFBFBF" w:sz="4"/>
               <w:left w:val="single" w:color="BFBFBF" w:sz="4"/>
@@ -6731,7 +6900,7 @@
         </w:tc>
         <w:tc>
           <w:tcPr>
-            <w:tcW w:type="dxa" w:w="7090"/>
+            <w:tcW w:type="dxa" w:w="7449"/>
             <w:tcBorders>
               <w:top w:val="single" w:color="BFBFBF" w:sz="4"/>
               <w:left w:val="single" w:color="BFBFBF" w:sz="4"/>
@@ -6766,61 +6935,61 @@
         </w:trPr>
         <w:tc>
           <w:tcPr>
-            <w:tcW w:type="dxa" w:w="2630"/>
-            <w:tcBorders>
-              <w:top w:val="single" w:color="BFBFBF" w:sz="4"/>
-              <w:left w:val="single" w:color="BFBFBF" w:sz="4"/>
-              <w:bottom w:val="single" w:color="BFBFBF" w:sz="4"/>
-              <w:right w:val="single" w:color="BFBFBF" w:sz="4"/>
-            </w:tcBorders>
-            <w:tcMar>
-              <w:top w:type="dxa" w:w="60"/>
-              <w:left w:type="dxa" w:w="100"/>
-              <w:bottom w:type="dxa" w:w="60"/>
-              <w:right w:type="dxa" w:w="100"/>
-            </w:tcMar>
-          </w:tcPr>
-          <w:p>
-            <w:pPr>
-              <w:spacing w:after="0"/>
-            </w:pPr>
-            <w:r>
-              <w:rPr>
-                <w:rFonts w:ascii="Calibri" w:cs="Calibri" w:eastAsia="Calibri" w:hAnsi="Calibri"/>
-                <w:sz w:val="19"/>
-                <w:szCs w:val="19"/>
-              </w:rPr>
-              <w:t xml:space="preserve">invite request</w:t>
-            </w:r>
-          </w:p>
-        </w:tc>
-        <w:tc>
-          <w:tcPr>
-            <w:tcW w:type="dxa" w:w="7090"/>
-            <w:tcBorders>
-              <w:top w:val="single" w:color="BFBFBF" w:sz="4"/>
-              <w:left w:val="single" w:color="BFBFBF" w:sz="4"/>
-              <w:bottom w:val="single" w:color="BFBFBF" w:sz="4"/>
-              <w:right w:val="single" w:color="BFBFBF" w:sz="4"/>
-            </w:tcBorders>
-            <w:tcMar>
-              <w:top w:type="dxa" w:w="60"/>
-              <w:left w:type="dxa" w:w="100"/>
-              <w:bottom w:type="dxa" w:w="60"/>
-              <w:right w:type="dxa" w:w="100"/>
-            </w:tcMar>
-          </w:tcPr>
-          <w:p>
-            <w:pPr>
-              <w:spacing w:after="0"/>
-            </w:pPr>
-            <w:r>
-              <w:rPr>
-                <w:rFonts w:ascii="Calibri" w:cs="Calibri" w:eastAsia="Calibri" w:hAnsi="Calibri"/>
-                <w:sz w:val="19"/>
-                <w:szCs w:val="19"/>
-              </w:rPr>
-              <w:t xml:space="preserve">3 / day per IP</w:t>
+            <w:tcW w:type="dxa" w:w="2271"/>
+            <w:tcBorders>
+              <w:top w:val="single" w:color="BFBFBF" w:sz="4"/>
+              <w:left w:val="single" w:color="BFBFBF" w:sz="4"/>
+              <w:bottom w:val="single" w:color="BFBFBF" w:sz="4"/>
+              <w:right w:val="single" w:color="BFBFBF" w:sz="4"/>
+            </w:tcBorders>
+            <w:tcMar>
+              <w:top w:type="dxa" w:w="60"/>
+              <w:left w:type="dxa" w:w="100"/>
+              <w:bottom w:type="dxa" w:w="60"/>
+              <w:right w:type="dxa" w:w="100"/>
+            </w:tcMar>
+          </w:tcPr>
+          <w:p>
+            <w:pPr>
+              <w:spacing w:after="0"/>
+            </w:pPr>
+            <w:r>
+              <w:rPr>
+                <w:rFonts w:ascii="Calibri" w:cs="Calibri" w:eastAsia="Calibri" w:hAnsi="Calibri"/>
+                <w:sz w:val="19"/>
+                <w:szCs w:val="19"/>
+              </w:rPr>
+              <w:t xml:space="preserve">resend confirmation email</w:t>
+            </w:r>
+          </w:p>
+        </w:tc>
+        <w:tc>
+          <w:tcPr>
+            <w:tcW w:type="dxa" w:w="7449"/>
+            <w:tcBorders>
+              <w:top w:val="single" w:color="BFBFBF" w:sz="4"/>
+              <w:left w:val="single" w:color="BFBFBF" w:sz="4"/>
+              <w:bottom w:val="single" w:color="BFBFBF" w:sz="4"/>
+              <w:right w:val="single" w:color="BFBFBF" w:sz="4"/>
+            </w:tcBorders>
+            <w:tcMar>
+              <w:top w:type="dxa" w:w="60"/>
+              <w:left w:type="dxa" w:w="100"/>
+              <w:bottom w:type="dxa" w:w="60"/>
+              <w:right w:type="dxa" w:w="100"/>
+            </w:tcMar>
+          </w:tcPr>
+          <w:p>
+            <w:pPr>
+              <w:spacing w:after="0"/>
+            </w:pPr>
+            <w:r>
+              <w:rPr>
+                <w:rFonts w:ascii="Calibri" w:cs="Calibri" w:eastAsia="Calibri" w:hAnsi="Calibri"/>
+                <w:sz w:val="19"/>
+                <w:szCs w:val="19"/>
+              </w:rPr>
+              <w:t xml:space="preserve">3 / hour per account</w:t>
             </w:r>
           </w:p>
         </w:tc>
@@ -6831,37 +7000,167 @@
         </w:trPr>
         <w:tc>
           <w:tcPr>
-            <w:tcW w:type="dxa" w:w="2630"/>
-            <w:tcBorders>
-              <w:top w:val="single" w:color="BFBFBF" w:sz="4"/>
-              <w:left w:val="single" w:color="BFBFBF" w:sz="4"/>
-              <w:bottom w:val="single" w:color="BFBFBF" w:sz="4"/>
-              <w:right w:val="single" w:color="BFBFBF" w:sz="4"/>
-            </w:tcBorders>
-            <w:tcMar>
-              <w:top w:type="dxa" w:w="60"/>
-              <w:left w:type="dxa" w:w="100"/>
-              <w:bottom w:type="dxa" w:w="60"/>
-              <w:right w:type="dxa" w:w="100"/>
-            </w:tcMar>
-          </w:tcPr>
-          <w:p>
-            <w:pPr>
-              <w:spacing w:after="0"/>
-            </w:pPr>
-            <w:r>
-              <w:rPr>
-                <w:rFonts w:ascii="Calibri" w:cs="Calibri" w:eastAsia="Calibri" w:hAnsi="Calibri"/>
-                <w:sz w:val="19"/>
-                <w:szCs w:val="19"/>
-              </w:rPr>
-              <w:t xml:space="preserve">feedback</w:t>
-            </w:r>
-          </w:p>
-        </w:tc>
-        <w:tc>
-          <w:tcPr>
-            <w:tcW w:type="dxa" w:w="7090"/>
+            <w:tcW w:type="dxa" w:w="2271"/>
+            <w:tcBorders>
+              <w:top w:val="single" w:color="BFBFBF" w:sz="4"/>
+              <w:left w:val="single" w:color="BFBFBF" w:sz="4"/>
+              <w:bottom w:val="single" w:color="BFBFBF" w:sz="4"/>
+              <w:right w:val="single" w:color="BFBFBF" w:sz="4"/>
+            </w:tcBorders>
+            <w:tcMar>
+              <w:top w:type="dxa" w:w="60"/>
+              <w:left w:type="dxa" w:w="100"/>
+              <w:bottom w:type="dxa" w:w="60"/>
+              <w:right w:type="dxa" w:w="100"/>
+            </w:tcMar>
+          </w:tcPr>
+          <w:p>
+            <w:pPr>
+              <w:spacing w:after="0"/>
+            </w:pPr>
+            <w:r>
+              <w:rPr>
+                <w:rFonts w:ascii="Calibri" w:cs="Calibri" w:eastAsia="Calibri" w:hAnsi="Calibri"/>
+                <w:sz w:val="19"/>
+                <w:szCs w:val="19"/>
+              </w:rPr>
+              <w:t xml:space="preserve">handoff redeem</w:t>
+            </w:r>
+          </w:p>
+        </w:tc>
+        <w:tc>
+          <w:tcPr>
+            <w:tcW w:type="dxa" w:w="7449"/>
+            <w:tcBorders>
+              <w:top w:val="single" w:color="BFBFBF" w:sz="4"/>
+              <w:left w:val="single" w:color="BFBFBF" w:sz="4"/>
+              <w:bottom w:val="single" w:color="BFBFBF" w:sz="4"/>
+              <w:right w:val="single" w:color="BFBFBF" w:sz="4"/>
+            </w:tcBorders>
+            <w:tcMar>
+              <w:top w:type="dxa" w:w="60"/>
+              <w:left w:type="dxa" w:w="100"/>
+              <w:bottom w:type="dxa" w:w="60"/>
+              <w:right w:type="dxa" w:w="100"/>
+            </w:tcMar>
+          </w:tcPr>
+          <w:p>
+            <w:pPr>
+              <w:spacing w:after="0"/>
+            </w:pPr>
+            <w:r>
+              <w:rPr>
+                <w:rFonts w:ascii="Calibri" w:cs="Calibri" w:eastAsia="Calibri" w:hAnsi="Calibri"/>
+                <w:sz w:val="19"/>
+                <w:szCs w:val="19"/>
+              </w:rPr>
+              <w:t xml:space="preserve">60 / minute per IP</w:t>
+            </w:r>
+          </w:p>
+        </w:tc>
+      </w:tr>
+      <w:tr>
+        <w:trPr>
+          <w:tblHeader w:val="false"/>
+        </w:trPr>
+        <w:tc>
+          <w:tcPr>
+            <w:tcW w:type="dxa" w:w="2271"/>
+            <w:tcBorders>
+              <w:top w:val="single" w:color="BFBFBF" w:sz="4"/>
+              <w:left w:val="single" w:color="BFBFBF" w:sz="4"/>
+              <w:bottom w:val="single" w:color="BFBFBF" w:sz="4"/>
+              <w:right w:val="single" w:color="BFBFBF" w:sz="4"/>
+            </w:tcBorders>
+            <w:tcMar>
+              <w:top w:type="dxa" w:w="60"/>
+              <w:left w:type="dxa" w:w="100"/>
+              <w:bottom w:type="dxa" w:w="60"/>
+              <w:right w:type="dxa" w:w="100"/>
+            </w:tcMar>
+          </w:tcPr>
+          <w:p>
+            <w:pPr>
+              <w:spacing w:after="0"/>
+            </w:pPr>
+            <w:r>
+              <w:rPr>
+                <w:rFonts w:ascii="Calibri" w:cs="Calibri" w:eastAsia="Calibri" w:hAnsi="Calibri"/>
+                <w:sz w:val="19"/>
+                <w:szCs w:val="19"/>
+              </w:rPr>
+              <w:t xml:space="preserve">invite request (M2)</w:t>
+            </w:r>
+          </w:p>
+        </w:tc>
+        <w:tc>
+          <w:tcPr>
+            <w:tcW w:type="dxa" w:w="7449"/>
+            <w:tcBorders>
+              <w:top w:val="single" w:color="BFBFBF" w:sz="4"/>
+              <w:left w:val="single" w:color="BFBFBF" w:sz="4"/>
+              <w:bottom w:val="single" w:color="BFBFBF" w:sz="4"/>
+              <w:right w:val="single" w:color="BFBFBF" w:sz="4"/>
+            </w:tcBorders>
+            <w:tcMar>
+              <w:top w:type="dxa" w:w="60"/>
+              <w:left w:type="dxa" w:w="100"/>
+              <w:bottom w:type="dxa" w:w="60"/>
+              <w:right w:type="dxa" w:w="100"/>
+            </w:tcMar>
+          </w:tcPr>
+          <w:p>
+            <w:pPr>
+              <w:spacing w:after="0"/>
+            </w:pPr>
+            <w:r>
+              <w:rPr>
+                <w:rFonts w:ascii="Calibri" w:cs="Calibri" w:eastAsia="Calibri" w:hAnsi="Calibri"/>
+                <w:sz w:val="19"/>
+                <w:szCs w:val="19"/>
+              </w:rPr>
+              <w:t xml:space="preserve">3 / day per IP</w:t>
+            </w:r>
+          </w:p>
+        </w:tc>
+      </w:tr>
+      <w:tr>
+        <w:trPr>
+          <w:tblHeader w:val="false"/>
+        </w:trPr>
+        <w:tc>
+          <w:tcPr>
+            <w:tcW w:type="dxa" w:w="2271"/>
+            <w:tcBorders>
+              <w:top w:val="single" w:color="BFBFBF" w:sz="4"/>
+              <w:left w:val="single" w:color="BFBFBF" w:sz="4"/>
+              <w:bottom w:val="single" w:color="BFBFBF" w:sz="4"/>
+              <w:right w:val="single" w:color="BFBFBF" w:sz="4"/>
+            </w:tcBorders>
+            <w:tcMar>
+              <w:top w:type="dxa" w:w="60"/>
+              <w:left w:type="dxa" w:w="100"/>
+              <w:bottom w:type="dxa" w:w="60"/>
+              <w:right w:type="dxa" w:w="100"/>
+            </w:tcMar>
+          </w:tcPr>
+          <w:p>
+            <w:pPr>
+              <w:spacing w:after="0"/>
+            </w:pPr>
+            <w:r>
+              <w:rPr>
+                <w:rFonts w:ascii="Calibri" w:cs="Calibri" w:eastAsia="Calibri" w:hAnsi="Calibri"/>
+                <w:sz w:val="19"/>
+                <w:szCs w:val="19"/>
+              </w:rPr>
+              <w:t xml:space="preserve">feedback (M4)</w:t>
+            </w:r>
+          </w:p>
+        </w:tc>
+        <w:tc>
+          <w:tcPr>
+            <w:tcW w:type="dxa" w:w="7449"/>
             <w:tcBorders>
               <w:top w:val="single" w:color="BFBFBF" w:sz="4"/>
               <w:left w:val="single" w:color="BFBFBF" w:sz="4"/>
@@ -6895,6 +7194,2063 @@
       <w:pPr>
         <w:spacing w:after="120"/>
       </w:pPr>
+    </w:p>
+    <w:p>
+      <w:pPr>
+        <w:pStyle w:val="Heading2"/>
+      </w:pPr>
+      <w:r>
+        <w:rPr>
+          <w:rFonts w:ascii="Calibri" w:cs="Calibri" w:eastAsia="Calibri" w:hAnsi="Calibri"/>
+        </w:rPr>
+        <w:t xml:space="preserve">5.9 Account API (built in M1)</w:t>
+      </w:r>
+    </w:p>
+    <w:p>
+      <w:pPr>
+        <w:spacing w:after="120"/>
+      </w:pPr>
+      <w:r>
+        <w:rPr>
+          <w:rFonts w:ascii="Calibri" w:cs="Calibri" w:eastAsia="Calibri" w:hAnsi="Calibri"/>
+        </w:rPr>
+        <w:t xml:space="preserve">All paths are under </w:t>
+      </w:r>
+      <w:r>
+        <w:rPr>
+          <w:rFonts w:ascii="Courier New" w:cs="Courier New" w:eastAsia="Courier New" w:hAnsi="Courier New"/>
+          <w:sz w:val="19"/>
+          <w:szCs w:val="19"/>
+        </w:rPr>
+        <w:t xml:space="preserve">https://api.gametronyx.com/api</w:t>
+      </w:r>
+      <w:r>
+        <w:rPr>
+          <w:rFonts w:ascii="Calibri" w:cs="Calibri" w:eastAsia="Calibri" w:hAnsi="Calibri"/>
+        </w:rPr>
+        <w:t xml:space="preserve">. </w:t>
+      </w:r>
+      <w:r>
+        <w:rPr>
+          <w:rFonts w:ascii="Courier New" w:cs="Courier New" w:eastAsia="Courier New" w:hAnsi="Courier New"/>
+          <w:sz w:val="19"/>
+          <w:szCs w:val="19"/>
+        </w:rPr>
+        <w:t xml:space="preserve">/auth/*</w:t>
+      </w:r>
+      <w:r>
+        <w:rPr>
+          <w:rFonts w:ascii="Calibri" w:cs="Calibri" w:eastAsia="Calibri" w:hAnsi="Calibri"/>
+        </w:rPr>
+        <w:t xml:space="preserve"> is also reachable same-origin at </w:t>
+      </w:r>
+      <w:r>
+        <w:rPr>
+          <w:rFonts w:ascii="Courier New" w:cs="Courier New" w:eastAsia="Courier New" w:hAnsi="Courier New"/>
+          <w:sz w:val="19"/>
+          <w:szCs w:val="19"/>
+        </w:rPr>
+        <w:t xml:space="preserve">noeasywayup.com/api/auth/*</w:t>
+      </w:r>
+      <w:r>
+        <w:rPr>
+          <w:rFonts w:ascii="Calibri" w:cs="Calibri" w:eastAsia="Calibri" w:hAnsi="Calibri"/>
+        </w:rPr>
+        <w:t xml:space="preserve">.</w:t>
+      </w:r>
+    </w:p>
+    <w:tbl>
+      <w:tblPr>
+        <w:tblW w:type="dxa" w:w="9720"/>
+        <w:tblBorders>
+          <w:top w:val="single" w:color="auto" w:sz="4"/>
+          <w:left w:val="single" w:color="auto" w:sz="4"/>
+          <w:bottom w:val="single" w:color="auto" w:sz="4"/>
+          <w:right w:val="single" w:color="auto" w:sz="4"/>
+          <w:insideH w:val="single" w:color="auto" w:sz="4"/>
+          <w:insideV w:val="single" w:color="auto" w:sz="4"/>
+        </w:tblBorders>
+        <w:tblLayout w:type="fixed"/>
+      </w:tblPr>
+      <w:tblGrid>
+        <w:gridCol w:w="4131"/>
+        <w:gridCol w:w="1021"/>
+        <w:gridCol w:w="4568"/>
+      </w:tblGrid>
+      <w:tr>
+        <w:trPr>
+          <w:tblHeader/>
+        </w:trPr>
+        <w:tc>
+          <w:tcPr>
+            <w:tcW w:type="dxa" w:w="4131"/>
+            <w:tcBorders>
+              <w:top w:val="single" w:color="BFBFBF" w:sz="4"/>
+              <w:left w:val="single" w:color="BFBFBF" w:sz="4"/>
+              <w:bottom w:val="single" w:color="BFBFBF" w:sz="4"/>
+              <w:right w:val="single" w:color="BFBFBF" w:sz="4"/>
+            </w:tcBorders>
+            <w:shd w:fill="2E2820" w:color="auto" w:val="clear"/>
+            <w:tcMar>
+              <w:top w:type="dxa" w:w="60"/>
+              <w:left w:type="dxa" w:w="100"/>
+              <w:bottom w:type="dxa" w:w="60"/>
+              <w:right w:type="dxa" w:w="100"/>
+            </w:tcMar>
+          </w:tcPr>
+          <w:p>
+            <w:pPr>
+              <w:spacing w:after="0"/>
+            </w:pPr>
+            <w:r>
+              <w:rPr>
+                <w:rFonts w:ascii="Calibri" w:cs="Calibri" w:eastAsia="Calibri" w:hAnsi="Calibri"/>
+                <w:b/>
+                <w:bCs/>
+                <w:color w:val="F2EBDB"/>
+                <w:sz w:val="19"/>
+                <w:szCs w:val="19"/>
+              </w:rPr>
+              <w:t xml:space="preserve">Method and path</w:t>
+            </w:r>
+          </w:p>
+        </w:tc>
+        <w:tc>
+          <w:tcPr>
+            <w:tcW w:type="dxa" w:w="1021"/>
+            <w:tcBorders>
+              <w:top w:val="single" w:color="BFBFBF" w:sz="4"/>
+              <w:left w:val="single" w:color="BFBFBF" w:sz="4"/>
+              <w:bottom w:val="single" w:color="BFBFBF" w:sz="4"/>
+              <w:right w:val="single" w:color="BFBFBF" w:sz="4"/>
+            </w:tcBorders>
+            <w:shd w:fill="2E2820" w:color="auto" w:val="clear"/>
+            <w:tcMar>
+              <w:top w:type="dxa" w:w="60"/>
+              <w:left w:type="dxa" w:w="100"/>
+              <w:bottom w:type="dxa" w:w="60"/>
+              <w:right w:type="dxa" w:w="100"/>
+            </w:tcMar>
+          </w:tcPr>
+          <w:p>
+            <w:pPr>
+              <w:spacing w:after="0"/>
+            </w:pPr>
+            <w:r>
+              <w:rPr>
+                <w:rFonts w:ascii="Calibri" w:cs="Calibri" w:eastAsia="Calibri" w:hAnsi="Calibri"/>
+                <w:b/>
+                <w:bCs/>
+                <w:color w:val="F2EBDB"/>
+                <w:sz w:val="19"/>
+                <w:szCs w:val="19"/>
+              </w:rPr>
+              <w:t xml:space="preserve">Auth</w:t>
+            </w:r>
+          </w:p>
+        </w:tc>
+        <w:tc>
+          <w:tcPr>
+            <w:tcW w:type="dxa" w:w="4568"/>
+            <w:tcBorders>
+              <w:top w:val="single" w:color="BFBFBF" w:sz="4"/>
+              <w:left w:val="single" w:color="BFBFBF" w:sz="4"/>
+              <w:bottom w:val="single" w:color="BFBFBF" w:sz="4"/>
+              <w:right w:val="single" w:color="BFBFBF" w:sz="4"/>
+            </w:tcBorders>
+            <w:shd w:fill="2E2820" w:color="auto" w:val="clear"/>
+            <w:tcMar>
+              <w:top w:type="dxa" w:w="60"/>
+              <w:left w:type="dxa" w:w="100"/>
+              <w:bottom w:type="dxa" w:w="60"/>
+              <w:right w:type="dxa" w:w="100"/>
+            </w:tcMar>
+          </w:tcPr>
+          <w:p>
+            <w:pPr>
+              <w:spacing w:after="0"/>
+            </w:pPr>
+            <w:r>
+              <w:rPr>
+                <w:rFonts w:ascii="Calibri" w:cs="Calibri" w:eastAsia="Calibri" w:hAnsi="Calibri"/>
+                <w:b/>
+                <w:bCs/>
+                <w:color w:val="F2EBDB"/>
+                <w:sz w:val="19"/>
+                <w:szCs w:val="19"/>
+              </w:rPr>
+              <w:t xml:space="preserve">Purpose</w:t>
+            </w:r>
+          </w:p>
+        </w:tc>
+      </w:tr>
+      <w:tr>
+        <w:trPr>
+          <w:tblHeader w:val="false"/>
+        </w:trPr>
+        <w:tc>
+          <w:tcPr>
+            <w:tcW w:type="dxa" w:w="4131"/>
+            <w:tcBorders>
+              <w:top w:val="single" w:color="BFBFBF" w:sz="4"/>
+              <w:left w:val="single" w:color="BFBFBF" w:sz="4"/>
+              <w:bottom w:val="single" w:color="BFBFBF" w:sz="4"/>
+              <w:right w:val="single" w:color="BFBFBF" w:sz="4"/>
+            </w:tcBorders>
+            <w:tcMar>
+              <w:top w:type="dxa" w:w="60"/>
+              <w:left w:type="dxa" w:w="100"/>
+              <w:bottom w:type="dxa" w:w="60"/>
+              <w:right w:type="dxa" w:w="100"/>
+            </w:tcMar>
+          </w:tcPr>
+          <w:p>
+            <w:pPr>
+              <w:spacing w:after="0"/>
+            </w:pPr>
+            <w:r>
+              <w:rPr>
+                <w:rFonts w:ascii="Courier New" w:cs="Courier New" w:eastAsia="Courier New" w:hAnsi="Courier New"/>
+                <w:sz w:val="17"/>
+                <w:szCs w:val="17"/>
+              </w:rPr>
+              <w:t xml:space="preserve">POST /auth/invite/check</w:t>
+            </w:r>
+            <w:r>
+              <w:rPr>
+                <w:rFonts w:ascii="Calibri" w:cs="Calibri" w:eastAsia="Calibri" w:hAnsi="Calibri"/>
+                <w:sz w:val="19"/>
+                <w:szCs w:val="19"/>
+              </w:rPr>
+              <w:t xml:space="preserve"> </w:t>
+            </w:r>
+            <w:r>
+              <w:rPr>
+                <w:rFonts w:ascii="Courier New" w:cs="Courier New" w:eastAsia="Courier New" w:hAnsi="Courier New"/>
+                <w:sz w:val="17"/>
+                <w:szCs w:val="17"/>
+              </w:rPr>
+              <w:t xml:space="preserve">{invite_code}</w:t>
+            </w:r>
+          </w:p>
+        </w:tc>
+        <w:tc>
+          <w:tcPr>
+            <w:tcW w:type="dxa" w:w="1021"/>
+            <w:tcBorders>
+              <w:top w:val="single" w:color="BFBFBF" w:sz="4"/>
+              <w:left w:val="single" w:color="BFBFBF" w:sz="4"/>
+              <w:bottom w:val="single" w:color="BFBFBF" w:sz="4"/>
+              <w:right w:val="single" w:color="BFBFBF" w:sz="4"/>
+            </w:tcBorders>
+            <w:tcMar>
+              <w:top w:type="dxa" w:w="60"/>
+              <w:left w:type="dxa" w:w="100"/>
+              <w:bottom w:type="dxa" w:w="60"/>
+              <w:right w:type="dxa" w:w="100"/>
+            </w:tcMar>
+          </w:tcPr>
+          <w:p>
+            <w:pPr>
+              <w:spacing w:after="0"/>
+            </w:pPr>
+            <w:r>
+              <w:rPr>
+                <w:rFonts w:ascii="Calibri" w:cs="Calibri" w:eastAsia="Calibri" w:hAnsi="Calibri"/>
+                <w:sz w:val="19"/>
+                <w:szCs w:val="19"/>
+              </w:rPr>
+              <w:t xml:space="preserve">none</w:t>
+            </w:r>
+          </w:p>
+        </w:tc>
+        <w:tc>
+          <w:tcPr>
+            <w:tcW w:type="dxa" w:w="4568"/>
+            <w:tcBorders>
+              <w:top w:val="single" w:color="BFBFBF" w:sz="4"/>
+              <w:left w:val="single" w:color="BFBFBF" w:sz="4"/>
+              <w:bottom w:val="single" w:color="BFBFBF" w:sz="4"/>
+              <w:right w:val="single" w:color="BFBFBF" w:sz="4"/>
+            </w:tcBorders>
+            <w:tcMar>
+              <w:top w:type="dxa" w:w="60"/>
+              <w:left w:type="dxa" w:w="100"/>
+              <w:bottom w:type="dxa" w:w="60"/>
+              <w:right w:type="dxa" w:w="100"/>
+            </w:tcMar>
+          </w:tcPr>
+          <w:p>
+            <w:pPr>
+              <w:spacing w:after="0"/>
+            </w:pPr>
+            <w:r>
+              <w:rPr>
+                <w:rFonts w:ascii="Calibri" w:cs="Calibri" w:eastAsia="Calibri" w:hAnsi="Calibri"/>
+                <w:sz w:val="19"/>
+                <w:szCs w:val="19"/>
+              </w:rPr>
+              <w:t xml:space="preserve">Step 1 of </w:t>
+            </w:r>
+            <w:r>
+              <w:rPr>
+                <w:rFonts w:ascii="Courier New" w:cs="Courier New" w:eastAsia="Courier New" w:hAnsi="Courier New"/>
+                <w:sz w:val="17"/>
+                <w:szCs w:val="17"/>
+              </w:rPr>
+              <w:t xml:space="preserve">/join</w:t>
+            </w:r>
+          </w:p>
+        </w:tc>
+      </w:tr>
+      <w:tr>
+        <w:trPr>
+          <w:tblHeader w:val="false"/>
+        </w:trPr>
+        <w:tc>
+          <w:tcPr>
+            <w:tcW w:type="dxa" w:w="4131"/>
+            <w:tcBorders>
+              <w:top w:val="single" w:color="BFBFBF" w:sz="4"/>
+              <w:left w:val="single" w:color="BFBFBF" w:sz="4"/>
+              <w:bottom w:val="single" w:color="BFBFBF" w:sz="4"/>
+              <w:right w:val="single" w:color="BFBFBF" w:sz="4"/>
+            </w:tcBorders>
+            <w:tcMar>
+              <w:top w:type="dxa" w:w="60"/>
+              <w:left w:type="dxa" w:w="100"/>
+              <w:bottom w:type="dxa" w:w="60"/>
+              <w:right w:type="dxa" w:w="100"/>
+            </w:tcMar>
+          </w:tcPr>
+          <w:p>
+            <w:pPr>
+              <w:spacing w:after="0"/>
+            </w:pPr>
+            <w:r>
+              <w:rPr>
+                <w:rFonts w:ascii="Courier New" w:cs="Courier New" w:eastAsia="Courier New" w:hAnsi="Courier New"/>
+                <w:sz w:val="17"/>
+                <w:szCs w:val="17"/>
+              </w:rPr>
+              <w:t xml:space="preserve">POST /auth/register</w:t>
+            </w:r>
+            <w:r>
+              <w:rPr>
+                <w:rFonts w:ascii="Calibri" w:cs="Calibri" w:eastAsia="Calibri" w:hAnsi="Calibri"/>
+                <w:sz w:val="19"/>
+                <w:szCs w:val="19"/>
+              </w:rPr>
+              <w:t xml:space="preserve"> </w:t>
+            </w:r>
+            <w:r>
+              <w:rPr>
+                <w:rFonts w:ascii="Courier New" w:cs="Courier New" w:eastAsia="Courier New" w:hAnsi="Courier New"/>
+                <w:sz w:val="17"/>
+                <w:szCs w:val="17"/>
+              </w:rPr>
+              <w:t xml:space="preserve">{invite_code, username, password, email?, timezone?}</w:t>
+            </w:r>
+          </w:p>
+        </w:tc>
+        <w:tc>
+          <w:tcPr>
+            <w:tcW w:type="dxa" w:w="1021"/>
+            <w:tcBorders>
+              <w:top w:val="single" w:color="BFBFBF" w:sz="4"/>
+              <w:left w:val="single" w:color="BFBFBF" w:sz="4"/>
+              <w:bottom w:val="single" w:color="BFBFBF" w:sz="4"/>
+              <w:right w:val="single" w:color="BFBFBF" w:sz="4"/>
+            </w:tcBorders>
+            <w:tcMar>
+              <w:top w:type="dxa" w:w="60"/>
+              <w:left w:type="dxa" w:w="100"/>
+              <w:bottom w:type="dxa" w:w="60"/>
+              <w:right w:type="dxa" w:w="100"/>
+            </w:tcMar>
+          </w:tcPr>
+          <w:p>
+            <w:pPr>
+              <w:spacing w:after="0"/>
+            </w:pPr>
+            <w:r>
+              <w:rPr>
+                <w:rFonts w:ascii="Calibri" w:cs="Calibri" w:eastAsia="Calibri" w:hAnsi="Calibri"/>
+                <w:sz w:val="19"/>
+                <w:szCs w:val="19"/>
+              </w:rPr>
+              <w:t xml:space="preserve">none</w:t>
+            </w:r>
+          </w:p>
+        </w:tc>
+        <w:tc>
+          <w:tcPr>
+            <w:tcW w:type="dxa" w:w="4568"/>
+            <w:tcBorders>
+              <w:top w:val="single" w:color="BFBFBF" w:sz="4"/>
+              <w:left w:val="single" w:color="BFBFBF" w:sz="4"/>
+              <w:bottom w:val="single" w:color="BFBFBF" w:sz="4"/>
+              <w:right w:val="single" w:color="BFBFBF" w:sz="4"/>
+            </w:tcBorders>
+            <w:tcMar>
+              <w:top w:type="dxa" w:w="60"/>
+              <w:left w:type="dxa" w:w="100"/>
+              <w:bottom w:type="dxa" w:w="60"/>
+              <w:right w:type="dxa" w:w="100"/>
+            </w:tcMar>
+          </w:tcPr>
+          <w:p>
+            <w:pPr>
+              <w:spacing w:after="0"/>
+            </w:pPr>
+            <w:r>
+              <w:rPr>
+                <w:rFonts w:ascii="Calibri" w:cs="Calibri" w:eastAsia="Calibri" w:hAnsi="Calibri"/>
+                <w:sz w:val="19"/>
+                <w:szCs w:val="19"/>
+              </w:rPr>
+              <w:t xml:space="preserve">Create an account; returns </w:t>
+            </w:r>
+            <w:r>
+              <w:rPr>
+                <w:rFonts w:ascii="Courier New" w:cs="Courier New" w:eastAsia="Courier New" w:hAnsi="Courier New"/>
+                <w:sz w:val="17"/>
+                <w:szCs w:val="17"/>
+              </w:rPr>
+              <w:t xml:space="preserve">{access_token}</w:t>
+            </w:r>
+          </w:p>
+        </w:tc>
+      </w:tr>
+      <w:tr>
+        <w:trPr>
+          <w:tblHeader w:val="false"/>
+        </w:trPr>
+        <w:tc>
+          <w:tcPr>
+            <w:tcW w:type="dxa" w:w="4131"/>
+            <w:tcBorders>
+              <w:top w:val="single" w:color="BFBFBF" w:sz="4"/>
+              <w:left w:val="single" w:color="BFBFBF" w:sz="4"/>
+              <w:bottom w:val="single" w:color="BFBFBF" w:sz="4"/>
+              <w:right w:val="single" w:color="BFBFBF" w:sz="4"/>
+            </w:tcBorders>
+            <w:tcMar>
+              <w:top w:type="dxa" w:w="60"/>
+              <w:left w:type="dxa" w:w="100"/>
+              <w:bottom w:type="dxa" w:w="60"/>
+              <w:right w:type="dxa" w:w="100"/>
+            </w:tcMar>
+          </w:tcPr>
+          <w:p>
+            <w:pPr>
+              <w:spacing w:after="0"/>
+            </w:pPr>
+            <w:r>
+              <w:rPr>
+                <w:rFonts w:ascii="Courier New" w:cs="Courier New" w:eastAsia="Courier New" w:hAnsi="Courier New"/>
+                <w:sz w:val="17"/>
+                <w:szCs w:val="17"/>
+              </w:rPr>
+              <w:t xml:space="preserve">POST /auth/login</w:t>
+            </w:r>
+            <w:r>
+              <w:rPr>
+                <w:rFonts w:ascii="Calibri" w:cs="Calibri" w:eastAsia="Calibri" w:hAnsi="Calibri"/>
+                <w:sz w:val="19"/>
+                <w:szCs w:val="19"/>
+              </w:rPr>
+              <w:t xml:space="preserve"> (form: </w:t>
+            </w:r>
+            <w:r>
+              <w:rPr>
+                <w:rFonts w:ascii="Courier New" w:cs="Courier New" w:eastAsia="Courier New" w:hAnsi="Courier New"/>
+                <w:sz w:val="17"/>
+                <w:szCs w:val="17"/>
+              </w:rPr>
+              <w:t xml:space="preserve">username</w:t>
+            </w:r>
+            <w:r>
+              <w:rPr>
+                <w:rFonts w:ascii="Calibri" w:cs="Calibri" w:eastAsia="Calibri" w:hAnsi="Calibri"/>
+                <w:sz w:val="19"/>
+                <w:szCs w:val="19"/>
+              </w:rPr>
+              <w:t xml:space="preserve">, </w:t>
+            </w:r>
+            <w:r>
+              <w:rPr>
+                <w:rFonts w:ascii="Courier New" w:cs="Courier New" w:eastAsia="Courier New" w:hAnsi="Courier New"/>
+                <w:sz w:val="17"/>
+                <w:szCs w:val="17"/>
+              </w:rPr>
+              <w:t xml:space="preserve">password</w:t>
+            </w:r>
+            <w:r>
+              <w:rPr>
+                <w:rFonts w:ascii="Calibri" w:cs="Calibri" w:eastAsia="Calibri" w:hAnsi="Calibri"/>
+                <w:sz w:val="19"/>
+                <w:szCs w:val="19"/>
+              </w:rPr>
+              <w:t xml:space="preserve">)</w:t>
+            </w:r>
+          </w:p>
+        </w:tc>
+        <w:tc>
+          <w:tcPr>
+            <w:tcW w:type="dxa" w:w="1021"/>
+            <w:tcBorders>
+              <w:top w:val="single" w:color="BFBFBF" w:sz="4"/>
+              <w:left w:val="single" w:color="BFBFBF" w:sz="4"/>
+              <w:bottom w:val="single" w:color="BFBFBF" w:sz="4"/>
+              <w:right w:val="single" w:color="BFBFBF" w:sz="4"/>
+            </w:tcBorders>
+            <w:tcMar>
+              <w:top w:type="dxa" w:w="60"/>
+              <w:left w:type="dxa" w:w="100"/>
+              <w:bottom w:type="dxa" w:w="60"/>
+              <w:right w:type="dxa" w:w="100"/>
+            </w:tcMar>
+          </w:tcPr>
+          <w:p>
+            <w:pPr>
+              <w:spacing w:after="0"/>
+            </w:pPr>
+            <w:r>
+              <w:rPr>
+                <w:rFonts w:ascii="Calibri" w:cs="Calibri" w:eastAsia="Calibri" w:hAnsi="Calibri"/>
+                <w:sz w:val="19"/>
+                <w:szCs w:val="19"/>
+              </w:rPr>
+              <w:t xml:space="preserve">none</w:t>
+            </w:r>
+          </w:p>
+        </w:tc>
+        <w:tc>
+          <w:tcPr>
+            <w:tcW w:type="dxa" w:w="4568"/>
+            <w:tcBorders>
+              <w:top w:val="single" w:color="BFBFBF" w:sz="4"/>
+              <w:left w:val="single" w:color="BFBFBF" w:sz="4"/>
+              <w:bottom w:val="single" w:color="BFBFBF" w:sz="4"/>
+              <w:right w:val="single" w:color="BFBFBF" w:sz="4"/>
+            </w:tcBorders>
+            <w:tcMar>
+              <w:top w:type="dxa" w:w="60"/>
+              <w:left w:type="dxa" w:w="100"/>
+              <w:bottom w:type="dxa" w:w="60"/>
+              <w:right w:type="dxa" w:w="100"/>
+            </w:tcMar>
+          </w:tcPr>
+          <w:p>
+            <w:pPr>
+              <w:spacing w:after="0"/>
+            </w:pPr>
+            <w:r>
+              <w:rPr>
+                <w:rFonts w:ascii="Calibri" w:cs="Calibri" w:eastAsia="Calibri" w:hAnsi="Calibri"/>
+                <w:sz w:val="19"/>
+                <w:szCs w:val="19"/>
+              </w:rPr>
+              <w:t xml:space="preserve">Username </w:t>
+            </w:r>
+            <w:r>
+              <w:rPr>
+                <w:rFonts w:ascii="Calibri" w:cs="Calibri" w:eastAsia="Calibri" w:hAnsi="Calibri"/>
+                <w:b/>
+                <w:bCs/>
+                <w:sz w:val="19"/>
+                <w:szCs w:val="19"/>
+              </w:rPr>
+              <w:t xml:space="preserve">or</w:t>
+            </w:r>
+            <w:r>
+              <w:rPr>
+                <w:rFonts w:ascii="Calibri" w:cs="Calibri" w:eastAsia="Calibri" w:hAnsi="Calibri"/>
+                <w:sz w:val="19"/>
+                <w:szCs w:val="19"/>
+              </w:rPr>
+              <w:t xml:space="preserve"> email; returns </w:t>
+            </w:r>
+            <w:r>
+              <w:rPr>
+                <w:rFonts w:ascii="Courier New" w:cs="Courier New" w:eastAsia="Courier New" w:hAnsi="Courier New"/>
+                <w:sz w:val="17"/>
+                <w:szCs w:val="17"/>
+              </w:rPr>
+              <w:t xml:space="preserve">{access_token}</w:t>
+            </w:r>
+          </w:p>
+        </w:tc>
+      </w:tr>
+      <w:tr>
+        <w:trPr>
+          <w:tblHeader w:val="false"/>
+        </w:trPr>
+        <w:tc>
+          <w:tcPr>
+            <w:tcW w:type="dxa" w:w="4131"/>
+            <w:tcBorders>
+              <w:top w:val="single" w:color="BFBFBF" w:sz="4"/>
+              <w:left w:val="single" w:color="BFBFBF" w:sz="4"/>
+              <w:bottom w:val="single" w:color="BFBFBF" w:sz="4"/>
+              <w:right w:val="single" w:color="BFBFBF" w:sz="4"/>
+            </w:tcBorders>
+            <w:tcMar>
+              <w:top w:type="dxa" w:w="60"/>
+              <w:left w:type="dxa" w:w="100"/>
+              <w:bottom w:type="dxa" w:w="60"/>
+              <w:right w:type="dxa" w:w="100"/>
+            </w:tcMar>
+          </w:tcPr>
+          <w:p>
+            <w:pPr>
+              <w:spacing w:after="0"/>
+            </w:pPr>
+            <w:r>
+              <w:rPr>
+                <w:rFonts w:ascii="Courier New" w:cs="Courier New" w:eastAsia="Courier New" w:hAnsi="Courier New"/>
+                <w:sz w:val="17"/>
+                <w:szCs w:val="17"/>
+              </w:rPr>
+              <w:t xml:space="preserve">GET /auth/me</w:t>
+            </w:r>
+          </w:p>
+        </w:tc>
+        <w:tc>
+          <w:tcPr>
+            <w:tcW w:type="dxa" w:w="1021"/>
+            <w:tcBorders>
+              <w:top w:val="single" w:color="BFBFBF" w:sz="4"/>
+              <w:left w:val="single" w:color="BFBFBF" w:sz="4"/>
+              <w:bottom w:val="single" w:color="BFBFBF" w:sz="4"/>
+              <w:right w:val="single" w:color="BFBFBF" w:sz="4"/>
+            </w:tcBorders>
+            <w:tcMar>
+              <w:top w:type="dxa" w:w="60"/>
+              <w:left w:type="dxa" w:w="100"/>
+              <w:bottom w:type="dxa" w:w="60"/>
+              <w:right w:type="dxa" w:w="100"/>
+            </w:tcMar>
+          </w:tcPr>
+          <w:p>
+            <w:pPr>
+              <w:spacing w:after="0"/>
+            </w:pPr>
+            <w:r>
+              <w:rPr>
+                <w:rFonts w:ascii="Calibri" w:cs="Calibri" w:eastAsia="Calibri" w:hAnsi="Calibri"/>
+                <w:sz w:val="19"/>
+                <w:szCs w:val="19"/>
+              </w:rPr>
+              <w:t xml:space="preserve">player</w:t>
+            </w:r>
+          </w:p>
+        </w:tc>
+        <w:tc>
+          <w:tcPr>
+            <w:tcW w:type="dxa" w:w="4568"/>
+            <w:tcBorders>
+              <w:top w:val="single" w:color="BFBFBF" w:sz="4"/>
+              <w:left w:val="single" w:color="BFBFBF" w:sz="4"/>
+              <w:bottom w:val="single" w:color="BFBFBF" w:sz="4"/>
+              <w:right w:val="single" w:color="BFBFBF" w:sz="4"/>
+            </w:tcBorders>
+            <w:tcMar>
+              <w:top w:type="dxa" w:w="60"/>
+              <w:left w:type="dxa" w:w="100"/>
+              <w:bottom w:type="dxa" w:w="60"/>
+              <w:right w:type="dxa" w:w="100"/>
+            </w:tcMar>
+          </w:tcPr>
+          <w:p>
+            <w:pPr>
+              <w:spacing w:after="0"/>
+            </w:pPr>
+            <w:r>
+              <w:rPr>
+                <w:rFonts w:ascii="Courier New" w:cs="Courier New" w:eastAsia="Courier New" w:hAnsi="Courier New"/>
+                <w:sz w:val="17"/>
+                <w:szCs w:val="17"/>
+              </w:rPr>
+              <w:t xml:space="preserve">id, username, email, email_verified, needs_email, role, timezone, reminder_default</w:t>
+            </w:r>
+          </w:p>
+        </w:tc>
+      </w:tr>
+      <w:tr>
+        <w:trPr>
+          <w:tblHeader w:val="false"/>
+        </w:trPr>
+        <w:tc>
+          <w:tcPr>
+            <w:tcW w:type="dxa" w:w="4131"/>
+            <w:tcBorders>
+              <w:top w:val="single" w:color="BFBFBF" w:sz="4"/>
+              <w:left w:val="single" w:color="BFBFBF" w:sz="4"/>
+              <w:bottom w:val="single" w:color="BFBFBF" w:sz="4"/>
+              <w:right w:val="single" w:color="BFBFBF" w:sz="4"/>
+            </w:tcBorders>
+            <w:tcMar>
+              <w:top w:type="dxa" w:w="60"/>
+              <w:left w:type="dxa" w:w="100"/>
+              <w:bottom w:type="dxa" w:w="60"/>
+              <w:right w:type="dxa" w:w="100"/>
+            </w:tcMar>
+          </w:tcPr>
+          <w:p>
+            <w:pPr>
+              <w:spacing w:after="0"/>
+            </w:pPr>
+            <w:r>
+              <w:rPr>
+                <w:rFonts w:ascii="Courier New" w:cs="Courier New" w:eastAsia="Courier New" w:hAnsi="Courier New"/>
+                <w:sz w:val="17"/>
+                <w:szCs w:val="17"/>
+              </w:rPr>
+              <w:t xml:space="preserve">PATCH /auth/me</w:t>
+            </w:r>
+            <w:r>
+              <w:rPr>
+                <w:rFonts w:ascii="Calibri" w:cs="Calibri" w:eastAsia="Calibri" w:hAnsi="Calibri"/>
+                <w:sz w:val="19"/>
+                <w:szCs w:val="19"/>
+              </w:rPr>
+              <w:t xml:space="preserve"> </w:t>
+            </w:r>
+            <w:r>
+              <w:rPr>
+                <w:rFonts w:ascii="Courier New" w:cs="Courier New" w:eastAsia="Courier New" w:hAnsi="Courier New"/>
+                <w:sz w:val="17"/>
+                <w:szCs w:val="17"/>
+              </w:rPr>
+              <w:t xml:space="preserve">{email?, timezone?, reminder_default?}</w:t>
+            </w:r>
+          </w:p>
+        </w:tc>
+        <w:tc>
+          <w:tcPr>
+            <w:tcW w:type="dxa" w:w="1021"/>
+            <w:tcBorders>
+              <w:top w:val="single" w:color="BFBFBF" w:sz="4"/>
+              <w:left w:val="single" w:color="BFBFBF" w:sz="4"/>
+              <w:bottom w:val="single" w:color="BFBFBF" w:sz="4"/>
+              <w:right w:val="single" w:color="BFBFBF" w:sz="4"/>
+            </w:tcBorders>
+            <w:tcMar>
+              <w:top w:type="dxa" w:w="60"/>
+              <w:left w:type="dxa" w:w="100"/>
+              <w:bottom w:type="dxa" w:w="60"/>
+              <w:right w:type="dxa" w:w="100"/>
+            </w:tcMar>
+          </w:tcPr>
+          <w:p>
+            <w:pPr>
+              <w:spacing w:after="0"/>
+            </w:pPr>
+            <w:r>
+              <w:rPr>
+                <w:rFonts w:ascii="Calibri" w:cs="Calibri" w:eastAsia="Calibri" w:hAnsi="Calibri"/>
+                <w:sz w:val="19"/>
+                <w:szCs w:val="19"/>
+              </w:rPr>
+              <w:t xml:space="preserve">player</w:t>
+            </w:r>
+          </w:p>
+        </w:tc>
+        <w:tc>
+          <w:tcPr>
+            <w:tcW w:type="dxa" w:w="4568"/>
+            <w:tcBorders>
+              <w:top w:val="single" w:color="BFBFBF" w:sz="4"/>
+              <w:left w:val="single" w:color="BFBFBF" w:sz="4"/>
+              <w:bottom w:val="single" w:color="BFBFBF" w:sz="4"/>
+              <w:right w:val="single" w:color="BFBFBF" w:sz="4"/>
+            </w:tcBorders>
+            <w:tcMar>
+              <w:top w:type="dxa" w:w="60"/>
+              <w:left w:type="dxa" w:w="100"/>
+              <w:bottom w:type="dxa" w:w="60"/>
+              <w:right w:type="dxa" w:w="100"/>
+            </w:tcMar>
+          </w:tcPr>
+          <w:p>
+            <w:pPr>
+              <w:spacing w:after="0"/>
+            </w:pPr>
+            <w:r>
+              <w:rPr>
+                <w:rFonts w:ascii="Calibri" w:cs="Calibri" w:eastAsia="Calibri" w:hAnsi="Calibri"/>
+                <w:sz w:val="19"/>
+                <w:szCs w:val="19"/>
+              </w:rPr>
+              <w:t xml:space="preserve">Add or change email (sends a confirmation), time zone, reminder default</w:t>
+            </w:r>
+          </w:p>
+        </w:tc>
+      </w:tr>
+      <w:tr>
+        <w:trPr>
+          <w:tblHeader w:val="false"/>
+        </w:trPr>
+        <w:tc>
+          <w:tcPr>
+            <w:tcW w:type="dxa" w:w="4131"/>
+            <w:tcBorders>
+              <w:top w:val="single" w:color="BFBFBF" w:sz="4"/>
+              <w:left w:val="single" w:color="BFBFBF" w:sz="4"/>
+              <w:bottom w:val="single" w:color="BFBFBF" w:sz="4"/>
+              <w:right w:val="single" w:color="BFBFBF" w:sz="4"/>
+            </w:tcBorders>
+            <w:tcMar>
+              <w:top w:type="dxa" w:w="60"/>
+              <w:left w:type="dxa" w:w="100"/>
+              <w:bottom w:type="dxa" w:w="60"/>
+              <w:right w:type="dxa" w:w="100"/>
+            </w:tcMar>
+          </w:tcPr>
+          <w:p>
+            <w:pPr>
+              <w:spacing w:after="0"/>
+            </w:pPr>
+            <w:r>
+              <w:rPr>
+                <w:rFonts w:ascii="Courier New" w:cs="Courier New" w:eastAsia="Courier New" w:hAnsi="Courier New"/>
+                <w:sz w:val="17"/>
+                <w:szCs w:val="17"/>
+              </w:rPr>
+              <w:t xml:space="preserve">POST /auth/me/password</w:t>
+            </w:r>
+            <w:r>
+              <w:rPr>
+                <w:rFonts w:ascii="Calibri" w:cs="Calibri" w:eastAsia="Calibri" w:hAnsi="Calibri"/>
+                <w:sz w:val="19"/>
+                <w:szCs w:val="19"/>
+              </w:rPr>
+              <w:t xml:space="preserve"> </w:t>
+            </w:r>
+            <w:r>
+              <w:rPr>
+                <w:rFonts w:ascii="Courier New" w:cs="Courier New" w:eastAsia="Courier New" w:hAnsi="Courier New"/>
+                <w:sz w:val="17"/>
+                <w:szCs w:val="17"/>
+              </w:rPr>
+              <w:t xml:space="preserve">{current_password, new_password}</w:t>
+            </w:r>
+          </w:p>
+        </w:tc>
+        <w:tc>
+          <w:tcPr>
+            <w:tcW w:type="dxa" w:w="1021"/>
+            <w:tcBorders>
+              <w:top w:val="single" w:color="BFBFBF" w:sz="4"/>
+              <w:left w:val="single" w:color="BFBFBF" w:sz="4"/>
+              <w:bottom w:val="single" w:color="BFBFBF" w:sz="4"/>
+              <w:right w:val="single" w:color="BFBFBF" w:sz="4"/>
+            </w:tcBorders>
+            <w:tcMar>
+              <w:top w:type="dxa" w:w="60"/>
+              <w:left w:type="dxa" w:w="100"/>
+              <w:bottom w:type="dxa" w:w="60"/>
+              <w:right w:type="dxa" w:w="100"/>
+            </w:tcMar>
+          </w:tcPr>
+          <w:p>
+            <w:pPr>
+              <w:spacing w:after="0"/>
+            </w:pPr>
+            <w:r>
+              <w:rPr>
+                <w:rFonts w:ascii="Calibri" w:cs="Calibri" w:eastAsia="Calibri" w:hAnsi="Calibri"/>
+                <w:sz w:val="19"/>
+                <w:szCs w:val="19"/>
+              </w:rPr>
+              <w:t xml:space="preserve">player</w:t>
+            </w:r>
+          </w:p>
+        </w:tc>
+        <w:tc>
+          <w:tcPr>
+            <w:tcW w:type="dxa" w:w="4568"/>
+            <w:tcBorders>
+              <w:top w:val="single" w:color="BFBFBF" w:sz="4"/>
+              <w:left w:val="single" w:color="BFBFBF" w:sz="4"/>
+              <w:bottom w:val="single" w:color="BFBFBF" w:sz="4"/>
+              <w:right w:val="single" w:color="BFBFBF" w:sz="4"/>
+            </w:tcBorders>
+            <w:tcMar>
+              <w:top w:type="dxa" w:w="60"/>
+              <w:left w:type="dxa" w:w="100"/>
+              <w:bottom w:type="dxa" w:w="60"/>
+              <w:right w:type="dxa" w:w="100"/>
+            </w:tcMar>
+          </w:tcPr>
+          <w:p>
+            <w:pPr>
+              <w:spacing w:after="0"/>
+            </w:pPr>
+            <w:r>
+              <w:rPr>
+                <w:rFonts w:ascii="Calibri" w:cs="Calibri" w:eastAsia="Calibri" w:hAnsi="Calibri"/>
+                <w:sz w:val="19"/>
+                <w:szCs w:val="19"/>
+              </w:rPr>
+              <w:t xml:space="preserve">Returns a fresh token; other sessions are signed out</w:t>
+            </w:r>
+          </w:p>
+        </w:tc>
+      </w:tr>
+      <w:tr>
+        <w:trPr>
+          <w:tblHeader w:val="false"/>
+        </w:trPr>
+        <w:tc>
+          <w:tcPr>
+            <w:tcW w:type="dxa" w:w="4131"/>
+            <w:tcBorders>
+              <w:top w:val="single" w:color="BFBFBF" w:sz="4"/>
+              <w:left w:val="single" w:color="BFBFBF" w:sz="4"/>
+              <w:bottom w:val="single" w:color="BFBFBF" w:sz="4"/>
+              <w:right w:val="single" w:color="BFBFBF" w:sz="4"/>
+            </w:tcBorders>
+            <w:tcMar>
+              <w:top w:type="dxa" w:w="60"/>
+              <w:left w:type="dxa" w:w="100"/>
+              <w:bottom w:type="dxa" w:w="60"/>
+              <w:right w:type="dxa" w:w="100"/>
+            </w:tcMar>
+          </w:tcPr>
+          <w:p>
+            <w:pPr>
+              <w:spacing w:after="0"/>
+            </w:pPr>
+            <w:r>
+              <w:rPr>
+                <w:rFonts w:ascii="Courier New" w:cs="Courier New" w:eastAsia="Courier New" w:hAnsi="Courier New"/>
+                <w:sz w:val="17"/>
+                <w:szCs w:val="17"/>
+              </w:rPr>
+              <w:t xml:space="preserve">POST /auth/email/verify</w:t>
+            </w:r>
+            <w:r>
+              <w:rPr>
+                <w:rFonts w:ascii="Calibri" w:cs="Calibri" w:eastAsia="Calibri" w:hAnsi="Calibri"/>
+                <w:sz w:val="19"/>
+                <w:szCs w:val="19"/>
+              </w:rPr>
+              <w:t xml:space="preserve"> </w:t>
+            </w:r>
+            <w:r>
+              <w:rPr>
+                <w:rFonts w:ascii="Courier New" w:cs="Courier New" w:eastAsia="Courier New" w:hAnsi="Courier New"/>
+                <w:sz w:val="17"/>
+                <w:szCs w:val="17"/>
+              </w:rPr>
+              <w:t xml:space="preserve">{token}</w:t>
+            </w:r>
+          </w:p>
+        </w:tc>
+        <w:tc>
+          <w:tcPr>
+            <w:tcW w:type="dxa" w:w="1021"/>
+            <w:tcBorders>
+              <w:top w:val="single" w:color="BFBFBF" w:sz="4"/>
+              <w:left w:val="single" w:color="BFBFBF" w:sz="4"/>
+              <w:bottom w:val="single" w:color="BFBFBF" w:sz="4"/>
+              <w:right w:val="single" w:color="BFBFBF" w:sz="4"/>
+            </w:tcBorders>
+            <w:tcMar>
+              <w:top w:type="dxa" w:w="60"/>
+              <w:left w:type="dxa" w:w="100"/>
+              <w:bottom w:type="dxa" w:w="60"/>
+              <w:right w:type="dxa" w:w="100"/>
+            </w:tcMar>
+          </w:tcPr>
+          <w:p>
+            <w:pPr>
+              <w:spacing w:after="0"/>
+            </w:pPr>
+            <w:r>
+              <w:rPr>
+                <w:rFonts w:ascii="Calibri" w:cs="Calibri" w:eastAsia="Calibri" w:hAnsi="Calibri"/>
+                <w:sz w:val="19"/>
+                <w:szCs w:val="19"/>
+              </w:rPr>
+              <w:t xml:space="preserve">none</w:t>
+            </w:r>
+          </w:p>
+        </w:tc>
+        <w:tc>
+          <w:tcPr>
+            <w:tcW w:type="dxa" w:w="4568"/>
+            <w:tcBorders>
+              <w:top w:val="single" w:color="BFBFBF" w:sz="4"/>
+              <w:left w:val="single" w:color="BFBFBF" w:sz="4"/>
+              <w:bottom w:val="single" w:color="BFBFBF" w:sz="4"/>
+              <w:right w:val="single" w:color="BFBFBF" w:sz="4"/>
+            </w:tcBorders>
+            <w:tcMar>
+              <w:top w:type="dxa" w:w="60"/>
+              <w:left w:type="dxa" w:w="100"/>
+              <w:bottom w:type="dxa" w:w="60"/>
+              <w:right w:type="dxa" w:w="100"/>
+            </w:tcMar>
+          </w:tcPr>
+          <w:p>
+            <w:pPr>
+              <w:spacing w:after="0"/>
+            </w:pPr>
+            <w:r>
+              <w:rPr>
+                <w:rFonts w:ascii="Calibri" w:cs="Calibri" w:eastAsia="Calibri" w:hAnsi="Calibri"/>
+                <w:sz w:val="19"/>
+                <w:szCs w:val="19"/>
+              </w:rPr>
+              <w:t xml:space="preserve">From the </w:t>
+            </w:r>
+            <w:r>
+              <w:rPr>
+                <w:rFonts w:ascii="Courier New" w:cs="Courier New" w:eastAsia="Courier New" w:hAnsi="Courier New"/>
+                <w:sz w:val="17"/>
+                <w:szCs w:val="17"/>
+              </w:rPr>
+              <w:t xml:space="preserve">/verify-email#token=…</w:t>
+            </w:r>
+            <w:r>
+              <w:rPr>
+                <w:rFonts w:ascii="Calibri" w:cs="Calibri" w:eastAsia="Calibri" w:hAnsi="Calibri"/>
+                <w:sz w:val="19"/>
+                <w:szCs w:val="19"/>
+              </w:rPr>
+              <w:t xml:space="preserve"> link</w:t>
+            </w:r>
+          </w:p>
+        </w:tc>
+      </w:tr>
+      <w:tr>
+        <w:trPr>
+          <w:tblHeader w:val="false"/>
+        </w:trPr>
+        <w:tc>
+          <w:tcPr>
+            <w:tcW w:type="dxa" w:w="4131"/>
+            <w:tcBorders>
+              <w:top w:val="single" w:color="BFBFBF" w:sz="4"/>
+              <w:left w:val="single" w:color="BFBFBF" w:sz="4"/>
+              <w:bottom w:val="single" w:color="BFBFBF" w:sz="4"/>
+              <w:right w:val="single" w:color="BFBFBF" w:sz="4"/>
+            </w:tcBorders>
+            <w:tcMar>
+              <w:top w:type="dxa" w:w="60"/>
+              <w:left w:type="dxa" w:w="100"/>
+              <w:bottom w:type="dxa" w:w="60"/>
+              <w:right w:type="dxa" w:w="100"/>
+            </w:tcMar>
+          </w:tcPr>
+          <w:p>
+            <w:pPr>
+              <w:spacing w:after="0"/>
+            </w:pPr>
+            <w:r>
+              <w:rPr>
+                <w:rFonts w:ascii="Courier New" w:cs="Courier New" w:eastAsia="Courier New" w:hAnsi="Courier New"/>
+                <w:sz w:val="17"/>
+                <w:szCs w:val="17"/>
+              </w:rPr>
+              <w:t xml:space="preserve">POST /auth/email/verify/resend</w:t>
+            </w:r>
+          </w:p>
+        </w:tc>
+        <w:tc>
+          <w:tcPr>
+            <w:tcW w:type="dxa" w:w="1021"/>
+            <w:tcBorders>
+              <w:top w:val="single" w:color="BFBFBF" w:sz="4"/>
+              <w:left w:val="single" w:color="BFBFBF" w:sz="4"/>
+              <w:bottom w:val="single" w:color="BFBFBF" w:sz="4"/>
+              <w:right w:val="single" w:color="BFBFBF" w:sz="4"/>
+            </w:tcBorders>
+            <w:tcMar>
+              <w:top w:type="dxa" w:w="60"/>
+              <w:left w:type="dxa" w:w="100"/>
+              <w:bottom w:type="dxa" w:w="60"/>
+              <w:right w:type="dxa" w:w="100"/>
+            </w:tcMar>
+          </w:tcPr>
+          <w:p>
+            <w:pPr>
+              <w:spacing w:after="0"/>
+            </w:pPr>
+            <w:r>
+              <w:rPr>
+                <w:rFonts w:ascii="Calibri" w:cs="Calibri" w:eastAsia="Calibri" w:hAnsi="Calibri"/>
+                <w:sz w:val="19"/>
+                <w:szCs w:val="19"/>
+              </w:rPr>
+              <w:t xml:space="preserve">player</w:t>
+            </w:r>
+          </w:p>
+        </w:tc>
+        <w:tc>
+          <w:tcPr>
+            <w:tcW w:type="dxa" w:w="4568"/>
+            <w:tcBorders>
+              <w:top w:val="single" w:color="BFBFBF" w:sz="4"/>
+              <w:left w:val="single" w:color="BFBFBF" w:sz="4"/>
+              <w:bottom w:val="single" w:color="BFBFBF" w:sz="4"/>
+              <w:right w:val="single" w:color="BFBFBF" w:sz="4"/>
+            </w:tcBorders>
+            <w:tcMar>
+              <w:top w:type="dxa" w:w="60"/>
+              <w:left w:type="dxa" w:w="100"/>
+              <w:bottom w:type="dxa" w:w="60"/>
+              <w:right w:type="dxa" w:w="100"/>
+            </w:tcMar>
+          </w:tcPr>
+          <w:p>
+            <w:pPr>
+              <w:spacing w:after="0"/>
+            </w:pPr>
+            <w:r>
+              <w:rPr>
+                <w:rFonts w:ascii="Calibri" w:cs="Calibri" w:eastAsia="Calibri" w:hAnsi="Calibri"/>
+                <w:sz w:val="19"/>
+                <w:szCs w:val="19"/>
+              </w:rPr>
+              <w:t xml:space="preserve">Resend the confirmation email</w:t>
+            </w:r>
+          </w:p>
+        </w:tc>
+      </w:tr>
+      <w:tr>
+        <w:trPr>
+          <w:tblHeader w:val="false"/>
+        </w:trPr>
+        <w:tc>
+          <w:tcPr>
+            <w:tcW w:type="dxa" w:w="4131"/>
+            <w:tcBorders>
+              <w:top w:val="single" w:color="BFBFBF" w:sz="4"/>
+              <w:left w:val="single" w:color="BFBFBF" w:sz="4"/>
+              <w:bottom w:val="single" w:color="BFBFBF" w:sz="4"/>
+              <w:right w:val="single" w:color="BFBFBF" w:sz="4"/>
+            </w:tcBorders>
+            <w:tcMar>
+              <w:top w:type="dxa" w:w="60"/>
+              <w:left w:type="dxa" w:w="100"/>
+              <w:bottom w:type="dxa" w:w="60"/>
+              <w:right w:type="dxa" w:w="100"/>
+            </w:tcMar>
+          </w:tcPr>
+          <w:p>
+            <w:pPr>
+              <w:spacing w:after="0"/>
+            </w:pPr>
+            <w:r>
+              <w:rPr>
+                <w:rFonts w:ascii="Courier New" w:cs="Courier New" w:eastAsia="Courier New" w:hAnsi="Courier New"/>
+                <w:sz w:val="17"/>
+                <w:szCs w:val="17"/>
+              </w:rPr>
+              <w:t xml:space="preserve">POST /auth/reset/request</w:t>
+            </w:r>
+            <w:r>
+              <w:rPr>
+                <w:rFonts w:ascii="Calibri" w:cs="Calibri" w:eastAsia="Calibri" w:hAnsi="Calibri"/>
+                <w:sz w:val="19"/>
+                <w:szCs w:val="19"/>
+              </w:rPr>
+              <w:t xml:space="preserve"> </w:t>
+            </w:r>
+            <w:r>
+              <w:rPr>
+                <w:rFonts w:ascii="Courier New" w:cs="Courier New" w:eastAsia="Courier New" w:hAnsi="Courier New"/>
+                <w:sz w:val="17"/>
+                <w:szCs w:val="17"/>
+              </w:rPr>
+              <w:t xml:space="preserve">{email}</w:t>
+            </w:r>
+          </w:p>
+        </w:tc>
+        <w:tc>
+          <w:tcPr>
+            <w:tcW w:type="dxa" w:w="1021"/>
+            <w:tcBorders>
+              <w:top w:val="single" w:color="BFBFBF" w:sz="4"/>
+              <w:left w:val="single" w:color="BFBFBF" w:sz="4"/>
+              <w:bottom w:val="single" w:color="BFBFBF" w:sz="4"/>
+              <w:right w:val="single" w:color="BFBFBF" w:sz="4"/>
+            </w:tcBorders>
+            <w:tcMar>
+              <w:top w:type="dxa" w:w="60"/>
+              <w:left w:type="dxa" w:w="100"/>
+              <w:bottom w:type="dxa" w:w="60"/>
+              <w:right w:type="dxa" w:w="100"/>
+            </w:tcMar>
+          </w:tcPr>
+          <w:p>
+            <w:pPr>
+              <w:spacing w:after="0"/>
+            </w:pPr>
+            <w:r>
+              <w:rPr>
+                <w:rFonts w:ascii="Calibri" w:cs="Calibri" w:eastAsia="Calibri" w:hAnsi="Calibri"/>
+                <w:sz w:val="19"/>
+                <w:szCs w:val="19"/>
+              </w:rPr>
+              <w:t xml:space="preserve">none</w:t>
+            </w:r>
+          </w:p>
+        </w:tc>
+        <w:tc>
+          <w:tcPr>
+            <w:tcW w:type="dxa" w:w="4568"/>
+            <w:tcBorders>
+              <w:top w:val="single" w:color="BFBFBF" w:sz="4"/>
+              <w:left w:val="single" w:color="BFBFBF" w:sz="4"/>
+              <w:bottom w:val="single" w:color="BFBFBF" w:sz="4"/>
+              <w:right w:val="single" w:color="BFBFBF" w:sz="4"/>
+            </w:tcBorders>
+            <w:tcMar>
+              <w:top w:type="dxa" w:w="60"/>
+              <w:left w:type="dxa" w:w="100"/>
+              <w:bottom w:type="dxa" w:w="60"/>
+              <w:right w:type="dxa" w:w="100"/>
+            </w:tcMar>
+          </w:tcPr>
+          <w:p>
+            <w:pPr>
+              <w:spacing w:after="0"/>
+            </w:pPr>
+            <w:r>
+              <w:rPr>
+                <w:rFonts w:ascii="Calibri" w:cs="Calibri" w:eastAsia="Calibri" w:hAnsi="Calibri"/>
+                <w:sz w:val="19"/>
+                <w:szCs w:val="19"/>
+              </w:rPr>
+              <w:t xml:space="preserve">Always </w:t>
+            </w:r>
+            <w:r>
+              <w:rPr>
+                <w:rFonts w:ascii="Courier New" w:cs="Courier New" w:eastAsia="Courier New" w:hAnsi="Courier New"/>
+                <w:sz w:val="17"/>
+                <w:szCs w:val="17"/>
+              </w:rPr>
+              <w:t xml:space="preserve">202</w:t>
+            </w:r>
+            <w:r>
+              <w:rPr>
+                <w:rFonts w:ascii="Calibri" w:cs="Calibri" w:eastAsia="Calibri" w:hAnsi="Calibri"/>
+                <w:sz w:val="19"/>
+                <w:szCs w:val="19"/>
+              </w:rPr>
+              <w:t xml:space="preserve">, whether or not the email has an account</w:t>
+            </w:r>
+          </w:p>
+        </w:tc>
+      </w:tr>
+      <w:tr>
+        <w:trPr>
+          <w:tblHeader w:val="false"/>
+        </w:trPr>
+        <w:tc>
+          <w:tcPr>
+            <w:tcW w:type="dxa" w:w="4131"/>
+            <w:tcBorders>
+              <w:top w:val="single" w:color="BFBFBF" w:sz="4"/>
+              <w:left w:val="single" w:color="BFBFBF" w:sz="4"/>
+              <w:bottom w:val="single" w:color="BFBFBF" w:sz="4"/>
+              <w:right w:val="single" w:color="BFBFBF" w:sz="4"/>
+            </w:tcBorders>
+            <w:tcMar>
+              <w:top w:type="dxa" w:w="60"/>
+              <w:left w:type="dxa" w:w="100"/>
+              <w:bottom w:type="dxa" w:w="60"/>
+              <w:right w:type="dxa" w:w="100"/>
+            </w:tcMar>
+          </w:tcPr>
+          <w:p>
+            <w:pPr>
+              <w:spacing w:after="0"/>
+            </w:pPr>
+            <w:r>
+              <w:rPr>
+                <w:rFonts w:ascii="Courier New" w:cs="Courier New" w:eastAsia="Courier New" w:hAnsi="Courier New"/>
+                <w:sz w:val="17"/>
+                <w:szCs w:val="17"/>
+              </w:rPr>
+              <w:t xml:space="preserve">POST /auth/reset/confirm</w:t>
+            </w:r>
+            <w:r>
+              <w:rPr>
+                <w:rFonts w:ascii="Calibri" w:cs="Calibri" w:eastAsia="Calibri" w:hAnsi="Calibri"/>
+                <w:sz w:val="19"/>
+                <w:szCs w:val="19"/>
+              </w:rPr>
+              <w:t xml:space="preserve"> </w:t>
+            </w:r>
+            <w:r>
+              <w:rPr>
+                <w:rFonts w:ascii="Courier New" w:cs="Courier New" w:eastAsia="Courier New" w:hAnsi="Courier New"/>
+                <w:sz w:val="17"/>
+                <w:szCs w:val="17"/>
+              </w:rPr>
+              <w:t xml:space="preserve">{token, password}</w:t>
+            </w:r>
+          </w:p>
+        </w:tc>
+        <w:tc>
+          <w:tcPr>
+            <w:tcW w:type="dxa" w:w="1021"/>
+            <w:tcBorders>
+              <w:top w:val="single" w:color="BFBFBF" w:sz="4"/>
+              <w:left w:val="single" w:color="BFBFBF" w:sz="4"/>
+              <w:bottom w:val="single" w:color="BFBFBF" w:sz="4"/>
+              <w:right w:val="single" w:color="BFBFBF" w:sz="4"/>
+            </w:tcBorders>
+            <w:tcMar>
+              <w:top w:type="dxa" w:w="60"/>
+              <w:left w:type="dxa" w:w="100"/>
+              <w:bottom w:type="dxa" w:w="60"/>
+              <w:right w:type="dxa" w:w="100"/>
+            </w:tcMar>
+          </w:tcPr>
+          <w:p>
+            <w:pPr>
+              <w:spacing w:after="0"/>
+            </w:pPr>
+            <w:r>
+              <w:rPr>
+                <w:rFonts w:ascii="Calibri" w:cs="Calibri" w:eastAsia="Calibri" w:hAnsi="Calibri"/>
+                <w:sz w:val="19"/>
+                <w:szCs w:val="19"/>
+              </w:rPr>
+              <w:t xml:space="preserve">none</w:t>
+            </w:r>
+          </w:p>
+        </w:tc>
+        <w:tc>
+          <w:tcPr>
+            <w:tcW w:type="dxa" w:w="4568"/>
+            <w:tcBorders>
+              <w:top w:val="single" w:color="BFBFBF" w:sz="4"/>
+              <w:left w:val="single" w:color="BFBFBF" w:sz="4"/>
+              <w:bottom w:val="single" w:color="BFBFBF" w:sz="4"/>
+              <w:right w:val="single" w:color="BFBFBF" w:sz="4"/>
+            </w:tcBorders>
+            <w:tcMar>
+              <w:top w:type="dxa" w:w="60"/>
+              <w:left w:type="dxa" w:w="100"/>
+              <w:bottom w:type="dxa" w:w="60"/>
+              <w:right w:type="dxa" w:w="100"/>
+            </w:tcMar>
+          </w:tcPr>
+          <w:p>
+            <w:pPr>
+              <w:spacing w:after="0"/>
+            </w:pPr>
+            <w:r>
+              <w:rPr>
+                <w:rFonts w:ascii="Calibri" w:cs="Calibri" w:eastAsia="Calibri" w:hAnsi="Calibri"/>
+                <w:sz w:val="19"/>
+                <w:szCs w:val="19"/>
+              </w:rPr>
+              <w:t xml:space="preserve">Returns </w:t>
+            </w:r>
+            <w:r>
+              <w:rPr>
+                <w:rFonts w:ascii="Courier New" w:cs="Courier New" w:eastAsia="Courier New" w:hAnsi="Courier New"/>
+                <w:sz w:val="17"/>
+                <w:szCs w:val="17"/>
+              </w:rPr>
+              <w:t xml:space="preserve">{access_token}</w:t>
+            </w:r>
+          </w:p>
+        </w:tc>
+      </w:tr>
+      <w:tr>
+        <w:trPr>
+          <w:tblHeader w:val="false"/>
+        </w:trPr>
+        <w:tc>
+          <w:tcPr>
+            <w:tcW w:type="dxa" w:w="4131"/>
+            <w:tcBorders>
+              <w:top w:val="single" w:color="BFBFBF" w:sz="4"/>
+              <w:left w:val="single" w:color="BFBFBF" w:sz="4"/>
+              <w:bottom w:val="single" w:color="BFBFBF" w:sz="4"/>
+              <w:right w:val="single" w:color="BFBFBF" w:sz="4"/>
+            </w:tcBorders>
+            <w:tcMar>
+              <w:top w:type="dxa" w:w="60"/>
+              <w:left w:type="dxa" w:w="100"/>
+              <w:bottom w:type="dxa" w:w="60"/>
+              <w:right w:type="dxa" w:w="100"/>
+            </w:tcMar>
+          </w:tcPr>
+          <w:p>
+            <w:pPr>
+              <w:spacing w:after="0"/>
+            </w:pPr>
+            <w:r>
+              <w:rPr>
+                <w:rFonts w:ascii="Courier New" w:cs="Courier New" w:eastAsia="Courier New" w:hAnsi="Courier New"/>
+                <w:sz w:val="17"/>
+                <w:szCs w:val="17"/>
+              </w:rPr>
+              <w:t xml:space="preserve">POST /auth/handoff</w:t>
+            </w:r>
+            <w:r>
+              <w:rPr>
+                <w:rFonts w:ascii="Calibri" w:cs="Calibri" w:eastAsia="Calibri" w:hAnsi="Calibri"/>
+                <w:sz w:val="19"/>
+                <w:szCs w:val="19"/>
+              </w:rPr>
+              <w:t xml:space="preserve"> </w:t>
+            </w:r>
+            <w:r>
+              <w:rPr>
+                <w:rFonts w:ascii="Courier New" w:cs="Courier New" w:eastAsia="Courier New" w:hAnsi="Courier New"/>
+                <w:sz w:val="17"/>
+                <w:szCs w:val="17"/>
+              </w:rPr>
+              <w:t xml:space="preserve">{game_slug}</w:t>
+            </w:r>
+          </w:p>
+        </w:tc>
+        <w:tc>
+          <w:tcPr>
+            <w:tcW w:type="dxa" w:w="1021"/>
+            <w:tcBorders>
+              <w:top w:val="single" w:color="BFBFBF" w:sz="4"/>
+              <w:left w:val="single" w:color="BFBFBF" w:sz="4"/>
+              <w:bottom w:val="single" w:color="BFBFBF" w:sz="4"/>
+              <w:right w:val="single" w:color="BFBFBF" w:sz="4"/>
+            </w:tcBorders>
+            <w:tcMar>
+              <w:top w:type="dxa" w:w="60"/>
+              <w:left w:type="dxa" w:w="100"/>
+              <w:bottom w:type="dxa" w:w="60"/>
+              <w:right w:type="dxa" w:w="100"/>
+            </w:tcMar>
+          </w:tcPr>
+          <w:p>
+            <w:pPr>
+              <w:spacing w:after="0"/>
+            </w:pPr>
+            <w:r>
+              <w:rPr>
+                <w:rFonts w:ascii="Calibri" w:cs="Calibri" w:eastAsia="Calibri" w:hAnsi="Calibri"/>
+                <w:sz w:val="19"/>
+                <w:szCs w:val="19"/>
+              </w:rPr>
+              <w:t xml:space="preserve">player</w:t>
+            </w:r>
+          </w:p>
+        </w:tc>
+        <w:tc>
+          <w:tcPr>
+            <w:tcW w:type="dxa" w:w="4568"/>
+            <w:tcBorders>
+              <w:top w:val="single" w:color="BFBFBF" w:sz="4"/>
+              <w:left w:val="single" w:color="BFBFBF" w:sz="4"/>
+              <w:bottom w:val="single" w:color="BFBFBF" w:sz="4"/>
+              <w:right w:val="single" w:color="BFBFBF" w:sz="4"/>
+            </w:tcBorders>
+            <w:tcMar>
+              <w:top w:type="dxa" w:w="60"/>
+              <w:left w:type="dxa" w:w="100"/>
+              <w:bottom w:type="dxa" w:w="60"/>
+              <w:right w:type="dxa" w:w="100"/>
+            </w:tcMar>
+          </w:tcPr>
+          <w:p>
+            <w:pPr>
+              <w:spacing w:after="0"/>
+            </w:pPr>
+            <w:r>
+              <w:rPr>
+                <w:rFonts w:ascii="Calibri" w:cs="Calibri" w:eastAsia="Calibri" w:hAnsi="Calibri"/>
+                <w:sz w:val="19"/>
+                <w:szCs w:val="19"/>
+              </w:rPr>
+              <w:t xml:space="preserve">Returns </w:t>
+            </w:r>
+            <w:r>
+              <w:rPr>
+                <w:rFonts w:ascii="Courier New" w:cs="Courier New" w:eastAsia="Courier New" w:hAnsi="Courier New"/>
+                <w:sz w:val="17"/>
+                <w:szCs w:val="17"/>
+              </w:rPr>
+              <w:t xml:space="preserve">{code, expires_in, launch_url}</w:t>
+            </w:r>
+          </w:p>
+        </w:tc>
+      </w:tr>
+      <w:tr>
+        <w:trPr>
+          <w:tblHeader w:val="false"/>
+        </w:trPr>
+        <w:tc>
+          <w:tcPr>
+            <w:tcW w:type="dxa" w:w="4131"/>
+            <w:tcBorders>
+              <w:top w:val="single" w:color="BFBFBF" w:sz="4"/>
+              <w:left w:val="single" w:color="BFBFBF" w:sz="4"/>
+              <w:bottom w:val="single" w:color="BFBFBF" w:sz="4"/>
+              <w:right w:val="single" w:color="BFBFBF" w:sz="4"/>
+            </w:tcBorders>
+            <w:tcMar>
+              <w:top w:type="dxa" w:w="60"/>
+              <w:left w:type="dxa" w:w="100"/>
+              <w:bottom w:type="dxa" w:w="60"/>
+              <w:right w:type="dxa" w:w="100"/>
+            </w:tcMar>
+          </w:tcPr>
+          <w:p>
+            <w:pPr>
+              <w:spacing w:after="0"/>
+            </w:pPr>
+            <w:r>
+              <w:rPr>
+                <w:rFonts w:ascii="Courier New" w:cs="Courier New" w:eastAsia="Courier New" w:hAnsi="Courier New"/>
+                <w:sz w:val="17"/>
+                <w:szCs w:val="17"/>
+              </w:rPr>
+              <w:t xml:space="preserve">POST /auth/handoff/redeem</w:t>
+            </w:r>
+            <w:r>
+              <w:rPr>
+                <w:rFonts w:ascii="Calibri" w:cs="Calibri" w:eastAsia="Calibri" w:hAnsi="Calibri"/>
+                <w:sz w:val="19"/>
+                <w:szCs w:val="19"/>
+              </w:rPr>
+              <w:t xml:space="preserve"> </w:t>
+            </w:r>
+            <w:r>
+              <w:rPr>
+                <w:rFonts w:ascii="Courier New" w:cs="Courier New" w:eastAsia="Courier New" w:hAnsi="Courier New"/>
+                <w:sz w:val="17"/>
+                <w:szCs w:val="17"/>
+              </w:rPr>
+              <w:t xml:space="preserve">{code}</w:t>
+            </w:r>
+          </w:p>
+        </w:tc>
+        <w:tc>
+          <w:tcPr>
+            <w:tcW w:type="dxa" w:w="1021"/>
+            <w:tcBorders>
+              <w:top w:val="single" w:color="BFBFBF" w:sz="4"/>
+              <w:left w:val="single" w:color="BFBFBF" w:sz="4"/>
+              <w:bottom w:val="single" w:color="BFBFBF" w:sz="4"/>
+              <w:right w:val="single" w:color="BFBFBF" w:sz="4"/>
+            </w:tcBorders>
+            <w:tcMar>
+              <w:top w:type="dxa" w:w="60"/>
+              <w:left w:type="dxa" w:w="100"/>
+              <w:bottom w:type="dxa" w:w="60"/>
+              <w:right w:type="dxa" w:w="100"/>
+            </w:tcMar>
+          </w:tcPr>
+          <w:p>
+            <w:pPr>
+              <w:spacing w:after="0"/>
+            </w:pPr>
+            <w:r>
+              <w:rPr>
+                <w:rFonts w:ascii="Calibri" w:cs="Calibri" w:eastAsia="Calibri" w:hAnsi="Calibri"/>
+                <w:sz w:val="19"/>
+                <w:szCs w:val="19"/>
+              </w:rPr>
+              <w:t xml:space="preserve">none</w:t>
+            </w:r>
+          </w:p>
+        </w:tc>
+        <w:tc>
+          <w:tcPr>
+            <w:tcW w:type="dxa" w:w="4568"/>
+            <w:tcBorders>
+              <w:top w:val="single" w:color="BFBFBF" w:sz="4"/>
+              <w:left w:val="single" w:color="BFBFBF" w:sz="4"/>
+              <w:bottom w:val="single" w:color="BFBFBF" w:sz="4"/>
+              <w:right w:val="single" w:color="BFBFBF" w:sz="4"/>
+            </w:tcBorders>
+            <w:tcMar>
+              <w:top w:type="dxa" w:w="60"/>
+              <w:left w:type="dxa" w:w="100"/>
+              <w:bottom w:type="dxa" w:w="60"/>
+              <w:right w:type="dxa" w:w="100"/>
+            </w:tcMar>
+          </w:tcPr>
+          <w:p>
+            <w:pPr>
+              <w:spacing w:after="0"/>
+            </w:pPr>
+            <w:r>
+              <w:rPr>
+                <w:rFonts w:ascii="Calibri" w:cs="Calibri" w:eastAsia="Calibri" w:hAnsi="Calibri"/>
+                <w:sz w:val="19"/>
+                <w:szCs w:val="19"/>
+              </w:rPr>
+              <w:t xml:space="preserve">Called by the game; returns </w:t>
+            </w:r>
+            <w:r>
+              <w:rPr>
+                <w:rFonts w:ascii="Courier New" w:cs="Courier New" w:eastAsia="Courier New" w:hAnsi="Courier New"/>
+                <w:sz w:val="17"/>
+                <w:szCs w:val="17"/>
+              </w:rPr>
+              <w:t xml:space="preserve">{access_token}</w:t>
+            </w:r>
+          </w:p>
+        </w:tc>
+      </w:tr>
+      <w:tr>
+        <w:trPr>
+          <w:tblHeader w:val="false"/>
+        </w:trPr>
+        <w:tc>
+          <w:tcPr>
+            <w:tcW w:type="dxa" w:w="4131"/>
+            <w:tcBorders>
+              <w:top w:val="single" w:color="BFBFBF" w:sz="4"/>
+              <w:left w:val="single" w:color="BFBFBF" w:sz="4"/>
+              <w:bottom w:val="single" w:color="BFBFBF" w:sz="4"/>
+              <w:right w:val="single" w:color="BFBFBF" w:sz="4"/>
+            </w:tcBorders>
+            <w:tcMar>
+              <w:top w:type="dxa" w:w="60"/>
+              <w:left w:type="dxa" w:w="100"/>
+              <w:bottom w:type="dxa" w:w="60"/>
+              <w:right w:type="dxa" w:w="100"/>
+            </w:tcMar>
+          </w:tcPr>
+          <w:p>
+            <w:pPr>
+              <w:spacing w:after="0"/>
+            </w:pPr>
+            <w:r>
+              <w:rPr>
+                <w:rFonts w:ascii="Courier New" w:cs="Courier New" w:eastAsia="Courier New" w:hAnsi="Courier New"/>
+                <w:sz w:val="17"/>
+                <w:szCs w:val="17"/>
+              </w:rPr>
+              <w:t xml:space="preserve">GET/POST /admin/invite-codes</w:t>
+            </w:r>
+            <w:r>
+              <w:rPr>
+                <w:rFonts w:ascii="Calibri" w:cs="Calibri" w:eastAsia="Calibri" w:hAnsi="Calibri"/>
+                <w:sz w:val="19"/>
+                <w:szCs w:val="19"/>
+              </w:rPr>
+              <w:t xml:space="preserve"> </w:t>
+            </w:r>
+            <w:r>
+              <w:rPr>
+                <w:rFonts w:ascii="Courier New" w:cs="Courier New" w:eastAsia="Courier New" w:hAnsi="Courier New"/>
+                <w:sz w:val="17"/>
+                <w:szCs w:val="17"/>
+              </w:rPr>
+              <w:t xml:space="preserve">{count, note?}</w:t>
+            </w:r>
+          </w:p>
+        </w:tc>
+        <w:tc>
+          <w:tcPr>
+            <w:tcW w:type="dxa" w:w="1021"/>
+            <w:tcBorders>
+              <w:top w:val="single" w:color="BFBFBF" w:sz="4"/>
+              <w:left w:val="single" w:color="BFBFBF" w:sz="4"/>
+              <w:bottom w:val="single" w:color="BFBFBF" w:sz="4"/>
+              <w:right w:val="single" w:color="BFBFBF" w:sz="4"/>
+            </w:tcBorders>
+            <w:tcMar>
+              <w:top w:type="dxa" w:w="60"/>
+              <w:left w:type="dxa" w:w="100"/>
+              <w:bottom w:type="dxa" w:w="60"/>
+              <w:right w:type="dxa" w:w="100"/>
+            </w:tcMar>
+          </w:tcPr>
+          <w:p>
+            <w:pPr>
+              <w:spacing w:after="0"/>
+            </w:pPr>
+            <w:r>
+              <w:rPr>
+                <w:rFonts w:ascii="Calibri" w:cs="Calibri" w:eastAsia="Calibri" w:hAnsi="Calibri"/>
+                <w:sz w:val="19"/>
+                <w:szCs w:val="19"/>
+              </w:rPr>
+              <w:t xml:space="preserve">admin</w:t>
+            </w:r>
+          </w:p>
+        </w:tc>
+        <w:tc>
+          <w:tcPr>
+            <w:tcW w:type="dxa" w:w="4568"/>
+            <w:tcBorders>
+              <w:top w:val="single" w:color="BFBFBF" w:sz="4"/>
+              <w:left w:val="single" w:color="BFBFBF" w:sz="4"/>
+              <w:bottom w:val="single" w:color="BFBFBF" w:sz="4"/>
+              <w:right w:val="single" w:color="BFBFBF" w:sz="4"/>
+            </w:tcBorders>
+            <w:tcMar>
+              <w:top w:type="dxa" w:w="60"/>
+              <w:left w:type="dxa" w:w="100"/>
+              <w:bottom w:type="dxa" w:w="60"/>
+              <w:right w:type="dxa" w:w="100"/>
+            </w:tcMar>
+          </w:tcPr>
+          <w:p>
+            <w:pPr>
+              <w:spacing w:after="0"/>
+            </w:pPr>
+            <w:r>
+              <w:rPr>
+                <w:rFonts w:ascii="Calibri" w:cs="Calibri" w:eastAsia="Calibri" w:hAnsi="Calibri"/>
+                <w:sz w:val="19"/>
+                <w:szCs w:val="19"/>
+              </w:rPr>
+              <w:t xml:space="preserve">List codes / mint one-off codes</w:t>
+            </w:r>
+          </w:p>
+        </w:tc>
+      </w:tr>
+      <w:tr>
+        <w:trPr>
+          <w:tblHeader w:val="false"/>
+        </w:trPr>
+        <w:tc>
+          <w:tcPr>
+            <w:tcW w:type="dxa" w:w="4131"/>
+            <w:tcBorders>
+              <w:top w:val="single" w:color="BFBFBF" w:sz="4"/>
+              <w:left w:val="single" w:color="BFBFBF" w:sz="4"/>
+              <w:bottom w:val="single" w:color="BFBFBF" w:sz="4"/>
+              <w:right w:val="single" w:color="BFBFBF" w:sz="4"/>
+            </w:tcBorders>
+            <w:tcMar>
+              <w:top w:type="dxa" w:w="60"/>
+              <w:left w:type="dxa" w:w="100"/>
+              <w:bottom w:type="dxa" w:w="60"/>
+              <w:right w:type="dxa" w:w="100"/>
+            </w:tcMar>
+          </w:tcPr>
+          <w:p>
+            <w:pPr>
+              <w:spacing w:after="0"/>
+            </w:pPr>
+            <w:r>
+              <w:rPr>
+                <w:rFonts w:ascii="Courier New" w:cs="Courier New" w:eastAsia="Courier New" w:hAnsi="Courier New"/>
+                <w:sz w:val="17"/>
+                <w:szCs w:val="17"/>
+              </w:rPr>
+              <w:t xml:space="preserve">POST /admin/invite-codes/{id}/revoke</w:t>
+            </w:r>
+          </w:p>
+        </w:tc>
+        <w:tc>
+          <w:tcPr>
+            <w:tcW w:type="dxa" w:w="1021"/>
+            <w:tcBorders>
+              <w:top w:val="single" w:color="BFBFBF" w:sz="4"/>
+              <w:left w:val="single" w:color="BFBFBF" w:sz="4"/>
+              <w:bottom w:val="single" w:color="BFBFBF" w:sz="4"/>
+              <w:right w:val="single" w:color="BFBFBF" w:sz="4"/>
+            </w:tcBorders>
+            <w:tcMar>
+              <w:top w:type="dxa" w:w="60"/>
+              <w:left w:type="dxa" w:w="100"/>
+              <w:bottom w:type="dxa" w:w="60"/>
+              <w:right w:type="dxa" w:w="100"/>
+            </w:tcMar>
+          </w:tcPr>
+          <w:p>
+            <w:pPr>
+              <w:spacing w:after="0"/>
+            </w:pPr>
+            <w:r>
+              <w:rPr>
+                <w:rFonts w:ascii="Calibri" w:cs="Calibri" w:eastAsia="Calibri" w:hAnsi="Calibri"/>
+                <w:sz w:val="19"/>
+                <w:szCs w:val="19"/>
+              </w:rPr>
+              <w:t xml:space="preserve">admin</w:t>
+            </w:r>
+          </w:p>
+        </w:tc>
+        <w:tc>
+          <w:tcPr>
+            <w:tcW w:type="dxa" w:w="4568"/>
+            <w:tcBorders>
+              <w:top w:val="single" w:color="BFBFBF" w:sz="4"/>
+              <w:left w:val="single" w:color="BFBFBF" w:sz="4"/>
+              <w:bottom w:val="single" w:color="BFBFBF" w:sz="4"/>
+              <w:right w:val="single" w:color="BFBFBF" w:sz="4"/>
+            </w:tcBorders>
+            <w:tcMar>
+              <w:top w:type="dxa" w:w="60"/>
+              <w:left w:type="dxa" w:w="100"/>
+              <w:bottom w:type="dxa" w:w="60"/>
+              <w:right w:type="dxa" w:w="100"/>
+            </w:tcMar>
+          </w:tcPr>
+          <w:p>
+            <w:pPr>
+              <w:spacing w:after="0"/>
+            </w:pPr>
+            <w:r>
+              <w:rPr>
+                <w:rFonts w:ascii="Calibri" w:cs="Calibri" w:eastAsia="Calibri" w:hAnsi="Calibri"/>
+                <w:sz w:val="19"/>
+                <w:szCs w:val="19"/>
+              </w:rPr>
+              <w:t xml:space="preserve">Revoke an unused one-off code</w:t>
+            </w:r>
+          </w:p>
+        </w:tc>
+      </w:tr>
+      <w:tr>
+        <w:trPr>
+          <w:tblHeader w:val="false"/>
+        </w:trPr>
+        <w:tc>
+          <w:tcPr>
+            <w:tcW w:type="dxa" w:w="4131"/>
+            <w:tcBorders>
+              <w:top w:val="single" w:color="BFBFBF" w:sz="4"/>
+              <w:left w:val="single" w:color="BFBFBF" w:sz="4"/>
+              <w:bottom w:val="single" w:color="BFBFBF" w:sz="4"/>
+              <w:right w:val="single" w:color="BFBFBF" w:sz="4"/>
+            </w:tcBorders>
+            <w:tcMar>
+              <w:top w:type="dxa" w:w="60"/>
+              <w:left w:type="dxa" w:w="100"/>
+              <w:bottom w:type="dxa" w:w="60"/>
+              <w:right w:type="dxa" w:w="100"/>
+            </w:tcMar>
+          </w:tcPr>
+          <w:p>
+            <w:pPr>
+              <w:spacing w:after="0"/>
+            </w:pPr>
+            <w:r>
+              <w:rPr>
+                <w:rFonts w:ascii="Courier New" w:cs="Courier New" w:eastAsia="Courier New" w:hAnsi="Courier New"/>
+                <w:sz w:val="17"/>
+                <w:szCs w:val="17"/>
+              </w:rPr>
+              <w:t xml:space="preserve">GET/POST /admin/invite-codes/master</w:t>
+            </w:r>
+            <w:r>
+              <w:rPr>
+                <w:rFonts w:ascii="Calibri" w:cs="Calibri" w:eastAsia="Calibri" w:hAnsi="Calibri"/>
+                <w:sz w:val="19"/>
+                <w:szCs w:val="19"/>
+              </w:rPr>
+              <w:t xml:space="preserve"> </w:t>
+            </w:r>
+            <w:r>
+              <w:rPr>
+                <w:rFonts w:ascii="Courier New" w:cs="Courier New" w:eastAsia="Courier New" w:hAnsi="Courier New"/>
+                <w:sz w:val="17"/>
+                <w:szCs w:val="17"/>
+              </w:rPr>
+              <w:t xml:space="preserve">{code?}</w:t>
+            </w:r>
+          </w:p>
+        </w:tc>
+        <w:tc>
+          <w:tcPr>
+            <w:tcW w:type="dxa" w:w="1021"/>
+            <w:tcBorders>
+              <w:top w:val="single" w:color="BFBFBF" w:sz="4"/>
+              <w:left w:val="single" w:color="BFBFBF" w:sz="4"/>
+              <w:bottom w:val="single" w:color="BFBFBF" w:sz="4"/>
+              <w:right w:val="single" w:color="BFBFBF" w:sz="4"/>
+            </w:tcBorders>
+            <w:tcMar>
+              <w:top w:type="dxa" w:w="60"/>
+              <w:left w:type="dxa" w:w="100"/>
+              <w:bottom w:type="dxa" w:w="60"/>
+              <w:right w:type="dxa" w:w="100"/>
+            </w:tcMar>
+          </w:tcPr>
+          <w:p>
+            <w:pPr>
+              <w:spacing w:after="0"/>
+            </w:pPr>
+            <w:r>
+              <w:rPr>
+                <w:rFonts w:ascii="Calibri" w:cs="Calibri" w:eastAsia="Calibri" w:hAnsi="Calibri"/>
+                <w:sz w:val="19"/>
+                <w:szCs w:val="19"/>
+              </w:rPr>
+              <w:t xml:space="preserve">admin</w:t>
+            </w:r>
+          </w:p>
+        </w:tc>
+        <w:tc>
+          <w:tcPr>
+            <w:tcW w:type="dxa" w:w="4568"/>
+            <w:tcBorders>
+              <w:top w:val="single" w:color="BFBFBF" w:sz="4"/>
+              <w:left w:val="single" w:color="BFBFBF" w:sz="4"/>
+              <w:bottom w:val="single" w:color="BFBFBF" w:sz="4"/>
+              <w:right w:val="single" w:color="BFBFBF" w:sz="4"/>
+            </w:tcBorders>
+            <w:tcMar>
+              <w:top w:type="dxa" w:w="60"/>
+              <w:left w:type="dxa" w:w="100"/>
+              <w:bottom w:type="dxa" w:w="60"/>
+              <w:right w:type="dxa" w:w="100"/>
+            </w:tcMar>
+          </w:tcPr>
+          <w:p>
+            <w:pPr>
+              <w:spacing w:after="0"/>
+            </w:pPr>
+            <w:r>
+              <w:rPr>
+                <w:rFonts w:ascii="Calibri" w:cs="Calibri" w:eastAsia="Calibri" w:hAnsi="Calibri"/>
+                <w:sz w:val="19"/>
+                <w:szCs w:val="19"/>
+              </w:rPr>
+              <w:t xml:space="preserve">Show the master code / rotate it (custom or generated)</w:t>
+            </w:r>
+          </w:p>
+        </w:tc>
+      </w:tr>
+    </w:tbl>
+    <w:p>
+      <w:pPr>
+        <w:spacing w:after="120"/>
+      </w:pPr>
+    </w:p>
+    <w:p>
+      <w:pPr>
+        <w:spacing w:after="120"/>
+      </w:pPr>
+      <w:r>
+        <w:rPr>
+          <w:rFonts w:ascii="Calibri" w:cs="Calibri" w:eastAsia="Calibri" w:hAnsi="Calibri"/>
+        </w:rPr>
+        <w:t xml:space="preserve">Errors come back as </w:t>
+      </w:r>
+      <w:r>
+        <w:rPr>
+          <w:rFonts w:ascii="Courier New" w:cs="Courier New" w:eastAsia="Courier New" w:hAnsi="Courier New"/>
+          <w:sz w:val="19"/>
+          <w:szCs w:val="19"/>
+        </w:rPr>
+        <w:t xml:space="preserve">{detail: "&lt;message&gt;"}</w:t>
+      </w:r>
+      <w:r>
+        <w:rPr>
+          <w:rFonts w:ascii="Calibri" w:cs="Calibri" w:eastAsia="Calibri" w:hAnsi="Calibri"/>
+        </w:rPr>
+        <w:t xml:space="preserve"> with </w:t>
+      </w:r>
+      <w:r>
+        <w:rPr>
+          <w:rFonts w:ascii="Courier New" w:cs="Courier New" w:eastAsia="Courier New" w:hAnsi="Courier New"/>
+          <w:sz w:val="19"/>
+          <w:szCs w:val="19"/>
+        </w:rPr>
+        <w:t xml:space="preserve">400</w:t>
+      </w:r>
+      <w:r>
+        <w:rPr>
+          <w:rFonts w:ascii="Calibri" w:cs="Calibri" w:eastAsia="Calibri" w:hAnsi="Calibri"/>
+        </w:rPr>
+        <w:t xml:space="preserve"> (bad input), </w:t>
+      </w:r>
+      <w:r>
+        <w:rPr>
+          <w:rFonts w:ascii="Courier New" w:cs="Courier New" w:eastAsia="Courier New" w:hAnsi="Courier New"/>
+          <w:sz w:val="19"/>
+          <w:szCs w:val="19"/>
+        </w:rPr>
+        <w:t xml:space="preserve">401</w:t>
+      </w:r>
+      <w:r>
+        <w:rPr>
+          <w:rFonts w:ascii="Calibri" w:cs="Calibri" w:eastAsia="Calibri" w:hAnsi="Calibri"/>
+        </w:rPr>
+        <w:t xml:space="preserve"> (no or expired session), </w:t>
+      </w:r>
+      <w:r>
+        <w:rPr>
+          <w:rFonts w:ascii="Courier New" w:cs="Courier New" w:eastAsia="Courier New" w:hAnsi="Courier New"/>
+          <w:sz w:val="19"/>
+          <w:szCs w:val="19"/>
+        </w:rPr>
+        <w:t xml:space="preserve">403</w:t>
+      </w:r>
+      <w:r>
+        <w:rPr>
+          <w:rFonts w:ascii="Calibri" w:cs="Calibri" w:eastAsia="Calibri" w:hAnsi="Calibri"/>
+        </w:rPr>
+        <w:t xml:space="preserve"> (disabled account or not an admin), </w:t>
+      </w:r>
+      <w:r>
+        <w:rPr>
+          <w:rFonts w:ascii="Courier New" w:cs="Courier New" w:eastAsia="Courier New" w:hAnsi="Courier New"/>
+          <w:sz w:val="19"/>
+          <w:szCs w:val="19"/>
+        </w:rPr>
+        <w:t xml:space="preserve">404</w:t>
+      </w:r>
+      <w:r>
+        <w:rPr>
+          <w:rFonts w:ascii="Calibri" w:cs="Calibri" w:eastAsia="Calibri" w:hAnsi="Calibri"/>
+        </w:rPr>
+        <w:t xml:space="preserve">, </w:t>
+      </w:r>
+      <w:r>
+        <w:rPr>
+          <w:rFonts w:ascii="Courier New" w:cs="Courier New" w:eastAsia="Courier New" w:hAnsi="Courier New"/>
+          <w:sz w:val="19"/>
+          <w:szCs w:val="19"/>
+        </w:rPr>
+        <w:t xml:space="preserve">409</w:t>
+      </w:r>
+      <w:r>
+        <w:rPr>
+          <w:rFonts w:ascii="Calibri" w:cs="Calibri" w:eastAsia="Calibri" w:hAnsi="Calibri"/>
+        </w:rPr>
+        <w:t xml:space="preserve"> (username or email taken) or </w:t>
+      </w:r>
+      <w:r>
+        <w:rPr>
+          <w:rFonts w:ascii="Courier New" w:cs="Courier New" w:eastAsia="Courier New" w:hAnsi="Courier New"/>
+          <w:sz w:val="19"/>
+          <w:szCs w:val="19"/>
+        </w:rPr>
+        <w:t xml:space="preserve">429</w:t>
+      </w:r>
+      <w:r>
+        <w:rPr>
+          <w:rFonts w:ascii="Calibri" w:cs="Calibri" w:eastAsia="Calibri" w:hAnsi="Calibri"/>
+        </w:rPr>
+        <w:t xml:space="preserve"> (rate limited, with </w:t>
+      </w:r>
+      <w:r>
+        <w:rPr>
+          <w:rFonts w:ascii="Courier New" w:cs="Courier New" w:eastAsia="Courier New" w:hAnsi="Courier New"/>
+          <w:sz w:val="19"/>
+          <w:szCs w:val="19"/>
+        </w:rPr>
+        <w:t xml:space="preserve">Retry-After</w:t>
+      </w:r>
+      <w:r>
+        <w:rPr>
+          <w:rFonts w:ascii="Calibri" w:cs="Calibri" w:eastAsia="Calibri" w:hAnsi="Calibri"/>
+        </w:rPr>
+        <w:t xml:space="preserve">). The site shows its own friendly copy for invite-code errors (§5.3).</w:t>
+      </w:r>
     </w:p>
     <w:p>
       <w:pPr>
@@ -12758,7 +15114,7 @@
                 <w:sz w:val="17"/>
                 <w:szCs w:val="17"/>
               </w:rPr>
-              <w:t xml:space="preserve">to</w:t>
+              <w:t xml:space="preserve">to_email</w:t>
             </w:r>
             <w:r>
               <w:rPr>
@@ -12814,6 +15170,102 @@
                 <w:sz w:val="19"/>
                 <w:szCs w:val="19"/>
               </w:rPr>
+              <w:t xml:space="preserve"> (</w:t>
+            </w:r>
+            <w:r>
+              <w:rPr>
+                <w:rFonts w:ascii="Courier New" w:cs="Courier New" w:eastAsia="Courier New" w:hAnsi="Courier New"/>
+                <w:sz w:val="17"/>
+                <w:szCs w:val="17"/>
+              </w:rPr>
+              <w:t xml:space="preserve">pending</w:t>
+            </w:r>
+            <w:r>
+              <w:rPr>
+                <w:rFonts w:ascii="Calibri" w:cs="Calibri" w:eastAsia="Calibri" w:hAnsi="Calibri"/>
+                <w:sz w:val="19"/>
+                <w:szCs w:val="19"/>
+              </w:rPr>
+              <w:t xml:space="preserve"> | </w:t>
+            </w:r>
+            <w:r>
+              <w:rPr>
+                <w:rFonts w:ascii="Courier New" w:cs="Courier New" w:eastAsia="Courier New" w:hAnsi="Courier New"/>
+                <w:sz w:val="17"/>
+                <w:szCs w:val="17"/>
+              </w:rPr>
+              <w:t xml:space="preserve">sending</w:t>
+            </w:r>
+            <w:r>
+              <w:rPr>
+                <w:rFonts w:ascii="Calibri" w:cs="Calibri" w:eastAsia="Calibri" w:hAnsi="Calibri"/>
+                <w:sz w:val="19"/>
+                <w:szCs w:val="19"/>
+              </w:rPr>
+              <w:t xml:space="preserve"> | </w:t>
+            </w:r>
+            <w:r>
+              <w:rPr>
+                <w:rFonts w:ascii="Courier New" w:cs="Courier New" w:eastAsia="Courier New" w:hAnsi="Courier New"/>
+                <w:sz w:val="17"/>
+                <w:szCs w:val="17"/>
+              </w:rPr>
+              <w:t xml:space="preserve">sent</w:t>
+            </w:r>
+            <w:r>
+              <w:rPr>
+                <w:rFonts w:ascii="Calibri" w:cs="Calibri" w:eastAsia="Calibri" w:hAnsi="Calibri"/>
+                <w:sz w:val="19"/>
+                <w:szCs w:val="19"/>
+              </w:rPr>
+              <w:t xml:space="preserve"> | </w:t>
+            </w:r>
+            <w:r>
+              <w:rPr>
+                <w:rFonts w:ascii="Courier New" w:cs="Courier New" w:eastAsia="Courier New" w:hAnsi="Courier New"/>
+                <w:sz w:val="17"/>
+                <w:szCs w:val="17"/>
+              </w:rPr>
+              <w:t xml:space="preserve">failed</w:t>
+            </w:r>
+            <w:r>
+              <w:rPr>
+                <w:rFonts w:ascii="Calibri" w:cs="Calibri" w:eastAsia="Calibri" w:hAnsi="Calibri"/>
+                <w:sz w:val="19"/>
+                <w:szCs w:val="19"/>
+              </w:rPr>
+              <w:t xml:space="preserve"> | </w:t>
+            </w:r>
+            <w:r>
+              <w:rPr>
+                <w:rFonts w:ascii="Courier New" w:cs="Courier New" w:eastAsia="Courier New" w:hAnsi="Courier New"/>
+                <w:sz w:val="17"/>
+                <w:szCs w:val="17"/>
+              </w:rPr>
+              <w:t xml:space="preserve">disabled</w:t>
+            </w:r>
+            <w:r>
+              <w:rPr>
+                <w:rFonts w:ascii="Calibri" w:cs="Calibri" w:eastAsia="Calibri" w:hAnsi="Calibri"/>
+                <w:sz w:val="19"/>
+                <w:szCs w:val="19"/>
+              </w:rPr>
+              <w:t xml:space="preserve">), </w:t>
+            </w:r>
+            <w:r>
+              <w:rPr>
+                <w:rFonts w:ascii="Courier New" w:cs="Courier New" w:eastAsia="Courier New" w:hAnsi="Courier New"/>
+                <w:sz w:val="17"/>
+                <w:szCs w:val="17"/>
+              </w:rPr>
+              <w:t xml:space="preserve">attempts</w:t>
+            </w:r>
+            <w:r>
+              <w:rPr>
+                <w:rFonts w:ascii="Calibri" w:cs="Calibri" w:eastAsia="Calibri" w:hAnsi="Calibri"/>
+                <w:sz w:val="19"/>
+                <w:szCs w:val="19"/>
+              </w:rPr>
               <w:t xml:space="preserve">, </w:t>
             </w:r>
             <w:r>
@@ -12822,7 +15274,7 @@
                 <w:sz w:val="17"/>
                 <w:szCs w:val="17"/>
               </w:rPr>
-              <w:t xml:space="preserve">attempts</w:t>
+              <w:t xml:space="preserve">last_error</w:t>
             </w:r>
             <w:r>
               <w:rPr>
@@ -12838,7 +15290,7 @@
                 <w:sz w:val="17"/>
                 <w:szCs w:val="17"/>
               </w:rPr>
-              <w:t xml:space="preserve">last_error</w:t>
+              <w:t xml:space="preserve">provider_id</w:t>
             </w:r>
             <w:r>
               <w:rPr>
@@ -12871,6 +15323,38 @@
                 <w:szCs w:val="17"/>
               </w:rPr>
               <w:t xml:space="preserve">sent_at</w:t>
+            </w:r>
+            <w:r>
+              <w:rPr>
+                <w:rFonts w:ascii="Calibri" w:cs="Calibri" w:eastAsia="Calibri" w:hAnsi="Calibri"/>
+                <w:sz w:val="19"/>
+                <w:szCs w:val="19"/>
+              </w:rPr>
+              <w:t xml:space="preserve">, </w:t>
+            </w:r>
+            <w:r>
+              <w:rPr>
+                <w:rFonts w:ascii="Courier New" w:cs="Courier New" w:eastAsia="Courier New" w:hAnsi="Courier New"/>
+                <w:sz w:val="17"/>
+                <w:szCs w:val="17"/>
+              </w:rPr>
+              <w:t xml:space="preserve">created_at</w:t>
+            </w:r>
+            <w:r>
+              <w:rPr>
+                <w:rFonts w:ascii="Calibri" w:cs="Calibri" w:eastAsia="Calibri" w:hAnsi="Calibri"/>
+                <w:sz w:val="19"/>
+                <w:szCs w:val="19"/>
+              </w:rPr>
+              <w:t xml:space="preserve">, </w:t>
+            </w:r>
+            <w:r>
+              <w:rPr>
+                <w:rFonts w:ascii="Courier New" w:cs="Courier New" w:eastAsia="Courier New" w:hAnsi="Courier New"/>
+                <w:sz w:val="17"/>
+                <w:szCs w:val="17"/>
+              </w:rPr>
+              <w:t xml:space="preserve">updated_at</w:t>
             </w:r>
           </w:p>
         </w:tc>
@@ -15368,15 +17852,43 @@
         <w:rPr>
           <w:rFonts w:ascii="Calibri" w:cs="Calibri" w:eastAsia="Calibri" w:hAnsi="Calibri"/>
         </w:rPr>
-        <w:t xml:space="preserve">: migrations </w:t>
-      </w:r>
-      <w:r>
-        <w:rPr>
-          <w:rFonts w:ascii="Courier New" w:cs="Courier New" w:eastAsia="Courier New" w:hAnsi="Courier New"/>
-          <w:sz w:val="19"/>
-          <w:szCs w:val="19"/>
-        </w:rPr>
-        <w:t xml:space="preserve">0006+</w:t>
+        <w:t xml:space="preserve"> (</w:t>
+      </w:r>
+      <w:r>
+        <w:rPr>
+          <w:rFonts w:ascii="Calibri" w:cs="Calibri" w:eastAsia="Calibri" w:hAnsi="Calibri"/>
+          <w:i/>
+          <w:iCs/>
+        </w:rPr>
+        <w:t xml:space="preserve">built</w:t>
+      </w:r>
+      <w:r>
+        <w:rPr>
+          <w:rFonts w:ascii="Calibri" w:cs="Calibri" w:eastAsia="Calibri" w:hAnsi="Calibri"/>
+        </w:rPr>
+        <w:t xml:space="preserve"> on EFdungeon branch </w:t>
+      </w:r>
+      <w:r>
+        <w:rPr>
+          <w:rFonts w:ascii="Courier New" w:cs="Courier New" w:eastAsia="Courier New" w:hAnsi="Courier New"/>
+          <w:sz w:val="19"/>
+          <w:szCs w:val="19"/>
+        </w:rPr>
+        <w:t xml:space="preserve">claude/exciting-cray-m4hq8k</w:t>
+      </w:r>
+      <w:r>
+        <w:rPr>
+          <w:rFonts w:ascii="Calibri" w:cs="Calibri" w:eastAsia="Calibri" w:hAnsi="Calibri"/>
+        </w:rPr>
+        <w:t xml:space="preserve">; not yet deployed): migration </w:t>
+      </w:r>
+      <w:r>
+        <w:rPr>
+          <w:rFonts w:ascii="Courier New" w:cs="Courier New" w:eastAsia="Courier New" w:hAnsi="Courier New"/>
+          <w:sz w:val="19"/>
+          <w:szCs w:val="19"/>
+        </w:rPr>
+        <w:t xml:space="preserve">0006</w:t>
       </w:r>
       <w:r>
         <w:rPr>
@@ -15396,7 +17908,7 @@
         <w:rPr>
           <w:rFonts w:ascii="Calibri" w:cs="Calibri" w:eastAsia="Calibri" w:hAnsi="Calibri"/>
         </w:rPr>
-        <w:t xml:space="preserve"> fix; invite master and revoke; reset; handoff; CORS; </w:t>
+        <w:t xml:space="preserve"> fix; invite master and revoke; reset; email confirmation; handoff; CORS; the </w:t>
       </w:r>
       <w:r>
         <w:rPr>
@@ -15410,7 +17922,49 @@
         <w:rPr>
           <w:rFonts w:ascii="Calibri" w:cs="Calibri" w:eastAsia="Calibri" w:hAnsi="Calibri"/>
         </w:rPr>
-        <w:t xml:space="preserve">.</w:t>
+        <w:t xml:space="preserve"> vhost; the notifications timer. The </w:t>
+      </w:r>
+      <w:r>
+        <w:rPr>
+          <w:rFonts w:ascii="Courier New" w:cs="Courier New" w:eastAsia="Courier New" w:hAnsi="Courier New"/>
+          <w:sz w:val="19"/>
+          <w:szCs w:val="19"/>
+        </w:rPr>
+        <w:t xml:space="preserve">settings</w:t>
+      </w:r>
+      <w:r>
+        <w:rPr>
+          <w:rFonts w:ascii="Calibri" w:cs="Calibri" w:eastAsia="Calibri" w:hAnsi="Calibri"/>
+        </w:rPr>
+        <w:t xml:space="preserve">, </w:t>
+      </w:r>
+      <w:r>
+        <w:rPr>
+          <w:rFonts w:ascii="Courier New" w:cs="Courier New" w:eastAsia="Courier New" w:hAnsi="Courier New"/>
+          <w:sz w:val="19"/>
+          <w:szCs w:val="19"/>
+        </w:rPr>
+        <w:t xml:space="preserve">invite_requests</w:t>
+      </w:r>
+      <w:r>
+        <w:rPr>
+          <w:rFonts w:ascii="Calibri" w:cs="Calibri" w:eastAsia="Calibri" w:hAnsi="Calibri"/>
+        </w:rPr>
+        <w:t xml:space="preserve">, </w:t>
+      </w:r>
+      <w:r>
+        <w:rPr>
+          <w:rFonts w:ascii="Courier New" w:cs="Courier New" w:eastAsia="Courier New" w:hAnsi="Courier New"/>
+          <w:sz w:val="19"/>
+          <w:szCs w:val="19"/>
+        </w:rPr>
+        <w:t xml:space="preserve">feedback</w:t>
+      </w:r>
+      <w:r>
+        <w:rPr>
+          <w:rFonts w:ascii="Calibri" w:cs="Calibri" w:eastAsia="Calibri" w:hAnsi="Calibri"/>
+        </w:rPr>
+        <w:t xml:space="preserve"> and playtest tables arrive with the milestones that use them.</w:t>
       </w:r>
     </w:p>
     <w:p>

</xml_diff>

<commit_message>
Design: mark M3 and M4 built; add /feedback to the API table
Co-Authored-By: Claude Opus 5.5 <noreply@anthropic.com>
Claude-Session: https://claude.ai/code/session_01N7nSKWzsuTFN8SufzNzF6N
</commit_message>
<xml_diff>
--- a/docs/Gametronyx_site_design.docx
+++ b/docs/Gametronyx_site_design.docx
@@ -10065,6 +10065,117 @@
           </w:p>
         </w:tc>
       </w:tr>
+      <w:tr>
+        <w:trPr>
+          <w:tblHeader w:val="false"/>
+        </w:trPr>
+        <w:tc>
+          <w:tcPr>
+            <w:tcW w:type="dxa" w:w="3983"/>
+            <w:tcBorders>
+              <w:top w:val="single" w:color="BFBFBF" w:sz="4"/>
+              <w:left w:val="single" w:color="BFBFBF" w:sz="4"/>
+              <w:bottom w:val="single" w:color="BFBFBF" w:sz="4"/>
+              <w:right w:val="single" w:color="BFBFBF" w:sz="4"/>
+            </w:tcBorders>
+            <w:tcMar>
+              <w:top w:type="dxa" w:w="60"/>
+              <w:left w:type="dxa" w:w="100"/>
+              <w:bottom w:type="dxa" w:w="60"/>
+              <w:right w:type="dxa" w:w="100"/>
+            </w:tcMar>
+          </w:tcPr>
+          <w:p>
+            <w:pPr>
+              <w:spacing w:after="0"/>
+            </w:pPr>
+            <w:r>
+              <w:rPr>
+                <w:rFonts w:ascii="Courier New" w:cs="Courier New" w:eastAsia="Courier New" w:hAnsi="Courier New"/>
+                <w:sz w:val="17"/>
+                <w:szCs w:val="17"/>
+              </w:rPr>
+              <w:t xml:space="preserve">POST /feedback</w:t>
+            </w:r>
+            <w:r>
+              <w:rPr>
+                <w:rFonts w:ascii="Calibri" w:cs="Calibri" w:eastAsia="Calibri" w:hAnsi="Calibri"/>
+                <w:sz w:val="19"/>
+                <w:szCs w:val="19"/>
+              </w:rPr>
+              <w:t xml:space="preserve"> </w:t>
+            </w:r>
+            <w:r>
+              <w:rPr>
+                <w:rFonts w:ascii="Courier New" w:cs="Courier New" w:eastAsia="Courier New" w:hAnsi="Courier New"/>
+                <w:sz w:val="17"/>
+                <w:szCs w:val="17"/>
+              </w:rPr>
+              <w:t xml:space="preserve">{game_slug, text, build_sha?, runs?, client?}</w:t>
+            </w:r>
+          </w:p>
+        </w:tc>
+        <w:tc>
+          <w:tcPr>
+            <w:tcW w:type="dxa" w:w="1020"/>
+            <w:tcBorders>
+              <w:top w:val="single" w:color="BFBFBF" w:sz="4"/>
+              <w:left w:val="single" w:color="BFBFBF" w:sz="4"/>
+              <w:bottom w:val="single" w:color="BFBFBF" w:sz="4"/>
+              <w:right w:val="single" w:color="BFBFBF" w:sz="4"/>
+            </w:tcBorders>
+            <w:tcMar>
+              <w:top w:type="dxa" w:w="60"/>
+              <w:left w:type="dxa" w:w="100"/>
+              <w:bottom w:type="dxa" w:w="60"/>
+              <w:right w:type="dxa" w:w="100"/>
+            </w:tcMar>
+          </w:tcPr>
+          <w:p>
+            <w:pPr>
+              <w:spacing w:after="0"/>
+            </w:pPr>
+            <w:r>
+              <w:rPr>
+                <w:rFonts w:ascii="Calibri" w:cs="Calibri" w:eastAsia="Calibri" w:hAnsi="Calibri"/>
+                <w:sz w:val="19"/>
+                <w:szCs w:val="19"/>
+              </w:rPr>
+              <w:t xml:space="preserve">player</w:t>
+            </w:r>
+          </w:p>
+        </w:tc>
+        <w:tc>
+          <w:tcPr>
+            <w:tcW w:type="dxa" w:w="4717"/>
+            <w:tcBorders>
+              <w:top w:val="single" w:color="BFBFBF" w:sz="4"/>
+              <w:left w:val="single" w:color="BFBFBF" w:sz="4"/>
+              <w:bottom w:val="single" w:color="BFBFBF" w:sz="4"/>
+              <w:right w:val="single" w:color="BFBFBF" w:sz="4"/>
+            </w:tcBorders>
+            <w:tcMar>
+              <w:top w:type="dxa" w:w="60"/>
+              <w:left w:type="dxa" w:w="100"/>
+              <w:bottom w:type="dxa" w:w="60"/>
+              <w:right w:type="dxa" w:w="100"/>
+            </w:tcMar>
+          </w:tcPr>
+          <w:p>
+            <w:pPr>
+              <w:spacing w:after="0"/>
+            </w:pPr>
+            <w:r>
+              <w:rPr>
+                <w:rFonts w:ascii="Calibri" w:cs="Calibri" w:eastAsia="Calibri" w:hAnsi="Calibri"/>
+                <w:sz w:val="19"/>
+                <w:szCs w:val="19"/>
+              </w:rPr>
+              <w:t xml:space="preserve">In-game feedback, filed as a GitHub issue in the background; 10 per hour (M4)</w:t>
+            </w:r>
+          </w:p>
+        </w:tc>
+      </w:tr>
     </w:tbl>
     <w:p>
       <w:pPr>
@@ -19068,7 +19179,35 @@
         <w:rPr>
           <w:rFonts w:ascii="Calibri" w:cs="Calibri" w:eastAsia="Calibri" w:hAnsi="Calibri"/>
         </w:rPr>
-        <w:t xml:space="preserve">: </w:t>
+        <w:t xml:space="preserve"> (</w:t>
+      </w:r>
+      <w:r>
+        <w:rPr>
+          <w:rFonts w:ascii="Calibri" w:cs="Calibri" w:eastAsia="Calibri" w:hAnsi="Calibri"/>
+          <w:i/>
+          <w:iCs/>
+        </w:rPr>
+        <w:t xml:space="preserve">built</w:t>
+      </w:r>
+      <w:r>
+        <w:rPr>
+          <w:rFonts w:ascii="Calibri" w:cs="Calibri" w:eastAsia="Calibri" w:hAnsi="Calibri"/>
+        </w:rPr>
+        <w:t xml:space="preserve">: NEWU on the EFdungeon branch, Jerboa on 3-minutes-to-midnight's </w:t>
+      </w:r>
+      <w:r>
+        <w:rPr>
+          <w:rFonts w:ascii="Courier New" w:cs="Courier New" w:eastAsia="Courier New" w:hAnsi="Courier New"/>
+          <w:sz w:val="19"/>
+          <w:szCs w:val="19"/>
+        </w:rPr>
+        <w:t xml:space="preserve">claude/exciting-cray-m4hq8k</w:t>
+      </w:r>
+      <w:r>
+        <w:rPr>
+          <w:rFonts w:ascii="Calibri" w:cs="Calibri" w:eastAsia="Calibri" w:hAnsi="Calibri"/>
+        </w:rPr>
+        <w:t xml:space="preserve">): </w:t>
       </w:r>
       <w:r>
         <w:rPr>
@@ -19082,7 +19221,7 @@
         <w:rPr>
           <w:rFonts w:ascii="Calibri" w:cs="Calibri" w:eastAsia="Calibri" w:hAnsi="Calibri"/>
         </w:rPr>
-        <w:t xml:space="preserve">, handoff in NEWU and Jerboa, removal of NEWU's basic auth.</w:t>
+        <w:t xml:space="preserve">, handoff in NEWU and Jerboa, and NEWU's basic auth removed from the repo configs. The live nginx edit is checklist step C7.</w:t>
       </w:r>
     </w:p>
     <w:p>
@@ -19106,21 +19245,35 @@
         <w:rPr>
           <w:rFonts w:ascii="Calibri" w:cs="Calibri" w:eastAsia="Calibri" w:hAnsi="Calibri"/>
         </w:rPr>
-        <w:t xml:space="preserve">: </w:t>
-      </w:r>
-      <w:r>
-        <w:rPr>
-          <w:rFonts w:ascii="Courier New" w:cs="Courier New" w:eastAsia="Courier New" w:hAnsi="Courier New"/>
-          <w:sz w:val="19"/>
-          <w:szCs w:val="19"/>
-        </w:rPr>
-        <w:t xml:space="preserve">feedback</w:t>
-      </w:r>
-      <w:r>
-        <w:rPr>
-          <w:rFonts w:ascii="Calibri" w:cs="Calibri" w:eastAsia="Calibri" w:hAnsi="Calibri"/>
-        </w:rPr>
-        <w:t xml:space="preserve"> API and GitHub issues; the Jerboa popup with tests.</w:t>
+        <w:t xml:space="preserve"> (</w:t>
+      </w:r>
+      <w:r>
+        <w:rPr>
+          <w:rFonts w:ascii="Calibri" w:cs="Calibri" w:eastAsia="Calibri" w:hAnsi="Calibri"/>
+          <w:i/>
+          <w:iCs/>
+        </w:rPr>
+        <w:t xml:space="preserve">built</w:t>
+      </w:r>
+      <w:r>
+        <w:rPr>
+          <w:rFonts w:ascii="Calibri" w:cs="Calibri" w:eastAsia="Calibri" w:hAnsi="Calibri"/>
+        </w:rPr>
+        <w:t xml:space="preserve">): </w:t>
+      </w:r>
+      <w:r>
+        <w:rPr>
+          <w:rFonts w:ascii="Courier New" w:cs="Courier New" w:eastAsia="Courier New" w:hAnsi="Courier New"/>
+          <w:sz w:val="19"/>
+          <w:szCs w:val="19"/>
+        </w:rPr>
+        <w:t xml:space="preserve">POST /api/feedback</w:t>
+      </w:r>
+      <w:r>
+        <w:rPr>
+          <w:rFonts w:ascii="Calibri" w:cs="Calibri" w:eastAsia="Calibri" w:hAnsi="Calibri"/>
+        </w:rPr>
+        <w:t xml:space="preserve">, GitHub issues with retries (EFdungeon branch); the Jerboa popup with tests (3-minutes-to-midnight branch).</w:t>
       </w:r>
     </w:p>
     <w:p>

</xml_diff>

<commit_message>
Handheld: level third key labelled "I have a code"
Tyler asked for the third key to be level, with "I have a code" under it
rather than "Start". The key is now a flat pill with a small ▶ on it.
The LCD says "Have a code? Press ▶", and the instructions name the
"I have a code" key. Signed in, the same key reads "My account". Docs
and decision A45 are updated to match.

Co-Authored-By: Claude Opus 5.5 <noreply@anthropic.com>
Claude-Session: https://claude.ai/code/session_01N7nSKWzsuTFN8SufzNzF6N
</commit_message>
<xml_diff>
--- a/docs/Gametronyx_site_design.docx
+++ b/docs/Gametronyx_site_design.docx
@@ -3182,7 +3182,7 @@
                 <w:sz w:val="19"/>
                 <w:szCs w:val="19"/>
               </w:rPr>
-              <w:t xml:space="preserve">. The GT-01 handheld (§4.4). Its A, B and Start keys are </w:t>
+              <w:t xml:space="preserve">. The GT-01 handheld (§4.4). Its A, B and ▶ keys are </w:t>
             </w:r>
             <w:r>
               <w:rPr>
@@ -4491,7 +4491,7 @@
         <w:rPr>
           <w:rFonts w:ascii="Calibri" w:cs="Calibri" w:eastAsia="Calibri" w:hAnsi="Calibri"/>
         </w:rPr>
-        <w:t xml:space="preserve"> = Log in, </w:t>
+        <w:t xml:space="preserve"> = Log in, and a small </w:t>
       </w:r>
       <w:r>
         <w:rPr>
@@ -4499,13 +4499,13 @@
           <w:b/>
           <w:bCs/>
         </w:rPr>
-        <w:t xml:space="preserve">Start</w:t>
-      </w:r>
-      <w:r>
-        <w:rPr>
-          <w:rFonts w:ascii="Calibri" w:cs="Calibri" w:eastAsia="Calibri" w:hAnsi="Calibri"/>
-        </w:rPr>
-        <w:t xml:space="preserve"> = I have a code.</w:t>
+        <w:t xml:space="preserve">▶</w:t>
+      </w:r>
+      <w:r>
+        <w:rPr>
+          <w:rFonts w:ascii="Calibri" w:cs="Calibri" w:eastAsia="Calibri" w:hAnsi="Calibri"/>
+        </w:rPr>
+        <w:t xml:space="preserve"> key = I have a code.</w:t>
       </w:r>
     </w:p>
     <w:p>
@@ -4557,7 +4557,7 @@
           <w:b/>
           <w:bCs/>
         </w:rPr>
-        <w:t xml:space="preserve">Start</w:t>
+        <w:t xml:space="preserve">▶</w:t>
       </w:r>
       <w:r>
         <w:rPr>

</xml_diff>

<commit_message>
Cartridges: show which platforms each game runs on
Tyler wants players to know the platform before they press Play (U22).
Each cartridge now has a "works on" tag under its name, with phone and
monitor icons:
- Jerboa: "Mobile or desktop", in teal.
- No Easy Way Up and Red Ring: "Desktop only", in red.

The mapping lives in src/lib/art.ts (PLATFORMS). A game that isn't
listed shows no tag.

Co-Authored-By: Claude Opus 5.5 <noreply@anthropic.com>
Claude-Session: https://claude.ai/code/session_01N7nSKWzsuTFN8SufzNzF6N
</commit_message>
<xml_diff>
--- a/docs/Gametronyx_site_design.docx
+++ b/docs/Gametronyx_site_design.docx
@@ -4603,7 +4603,35 @@
         <w:rPr>
           <w:rFonts w:ascii="Calibri" w:cs="Calibri" w:eastAsia="Calibri" w:hAnsi="Calibri"/>
         </w:rPr>
-        <w:t xml:space="preserve"> A game card has grip ridges and a paper label. It shows the game's art, its catalogue number (GT-02, GT-03, GT-04), the pitch and a status line. Art comes from the game's </w:t>
+        <w:t xml:space="preserve"> A game card has grip ridges and a paper label. It shows the game's art, its catalogue number (GT-02, GT-03, GT-04), a platform tag, the pitch and a status line. The platform tag is teal "Mobile or desktop" for Jerboa and red "Desktop only" for No Easy Way Up and Red Ring (U22). It is set per game in </w:t>
+      </w:r>
+      <w:r>
+        <w:rPr>
+          <w:rFonts w:ascii="Courier New" w:cs="Courier New" w:eastAsia="Courier New" w:hAnsi="Courier New"/>
+          <w:sz w:val="19"/>
+          <w:szCs w:val="19"/>
+        </w:rPr>
+        <w:t xml:space="preserve">src/lib/art.ts</w:t>
+      </w:r>
+      <w:r>
+        <w:rPr>
+          <w:rFonts w:ascii="Calibri" w:cs="Calibri" w:eastAsia="Calibri" w:hAnsi="Calibri"/>
+        </w:rPr>
+        <w:t xml:space="preserve"> (</w:t>
+      </w:r>
+      <w:r>
+        <w:rPr>
+          <w:rFonts w:ascii="Courier New" w:cs="Courier New" w:eastAsia="Courier New" w:hAnsi="Courier New"/>
+          <w:sz w:val="19"/>
+          <w:szCs w:val="19"/>
+        </w:rPr>
+        <w:t xml:space="preserve">PLATFORMS</w:t>
+      </w:r>
+      <w:r>
+        <w:rPr>
+          <w:rFonts w:ascii="Calibri" w:cs="Calibri" w:eastAsia="Calibri" w:hAnsi="Calibri"/>
+        </w:rPr>
+        <w:t xml:space="preserve">). Art comes from the game's </w:t>
       </w:r>
       <w:r>
         <w:rPr>

</xml_diff>

<commit_message>
Cartridges: drop the "Visit site" link
Tyler: the link isn't needed, because Play already opens the game (U23).
It showed on No Easy Way Up, from its site_url, and pushed that card's
button out of line with the other two. Cards no longer render site_url.
The field stays in admin, and the footer keeps its noeasywayup.com link.

Co-Authored-By: Claude Opus 5.5 <noreply@anthropic.com>
Claude-Session: https://claude.ai/code/session_01N7nSKWzsuTFN8SufzNzF6N
</commit_message>
<xml_diff>
--- a/docs/Gametronyx_site_design.docx
+++ b/docs/Gametronyx_site_design.docx
@@ -20019,7 +20019,7 @@
         <w:rPr>
           <w:rFonts w:ascii="Calibri" w:cs="Calibri" w:eastAsia="Calibri" w:hAnsi="Calibri"/>
         </w:rPr>
-        <w:t xml:space="preserve">The showcase links out to </w:t>
+        <w:t xml:space="preserve">Game cards carry </w:t>
       </w:r>
       <w:r>
         <w:rPr>
@@ -20027,27 +20027,27 @@
           <w:b/>
           <w:bCs/>
         </w:rPr>
-        <w:t xml:space="preserve">noeasywayup.com only</w:t>
-      </w:r>
-      <w:r>
-        <w:rPr>
-          <w:rFonts w:ascii="Calibri" w:cs="Calibri" w:eastAsia="Calibri" w:hAnsi="Calibri"/>
-        </w:rPr>
-        <w:t xml:space="preserve">, for now. More can be added later as </w:t>
-      </w:r>
-      <w:r>
-        <w:rPr>
-          <w:rFonts w:ascii="Calibri" w:cs="Calibri" w:eastAsia="Calibri" w:hAnsi="Calibri"/>
-          <w:i/>
-          <w:iCs/>
-        </w:rPr>
-        <w:t xml:space="preserve">showcase only</w:t>
-      </w:r>
-      <w:r>
-        <w:rPr>
-          <w:rFonts w:ascii="Calibri" w:cs="Calibri" w:eastAsia="Calibri" w:hAnsi="Calibri"/>
-        </w:rPr>
-        <w:t xml:space="preserve"> games in admin.</w:t>
+        <w:t xml:space="preserve">no website link</w:t>
+      </w:r>
+      <w:r>
+        <w:rPr>
+          <w:rFonts w:ascii="Calibri" w:cs="Calibri" w:eastAsia="Calibri" w:hAnsi="Calibri"/>
+        </w:rPr>
+        <w:t xml:space="preserve">: the Play button already opens the game (U23). A game's </w:t>
+      </w:r>
+      <w:r>
+        <w:rPr>
+          <w:rFonts w:ascii="Courier New" w:cs="Courier New" w:eastAsia="Courier New" w:hAnsi="Courier New"/>
+          <w:sz w:val="19"/>
+          <w:szCs w:val="19"/>
+        </w:rPr>
+        <w:t xml:space="preserve">site_url</w:t>
+      </w:r>
+      <w:r>
+        <w:rPr>
+          <w:rFonts w:ascii="Calibri" w:cs="Calibri" w:eastAsia="Calibri" w:hAnsi="Calibri"/>
+        </w:rPr>
+        <w:t xml:space="preserve"> stays in admin but isn't shown. The footer keeps one link, to noeasywayup.com.</w:t>
       </w:r>
     </w:p>
     <w:p>

</xml_diff>